<commit_message>
change High Resolution to Analogue Mode option and add warming message if no SALEAE logic is being atatched
</commit_message>
<xml_diff>
--- a/docs/wcs_logger.docx
+++ b/docs/wcs_logger.docx
@@ -35,7 +35,7 @@
           <w:rPr>
             <w:lang w:val="en-GB"/>
           </w:rPr>
-          <w:t>automation tool to assist end-user in WCS PC host application</w:t>
+          <w:t>The assistant in WCS PC host applications</w:t>
         </w:r>
       </w:fldSimple>
     </w:p>
@@ -43,7 +43,7 @@
       <w:pPr>
         <w:pStyle w:val="HeadingPreface"/>
       </w:pPr>
-      <w:bookmarkStart w:id="1" w:name="_Toc140759456"/>
+      <w:bookmarkStart w:id="1" w:name="_Toc141081659"/>
       <w:bookmarkEnd w:id="0"/>
       <w:r>
         <w:t>About this document</w:t>
@@ -176,7 +176,7 @@
           <w:r>
             <w:fldChar w:fldCharType="separate"/>
           </w:r>
-          <w:hyperlink w:anchor="_Toc140759456" w:history="1">
+          <w:hyperlink w:anchor="_Toc141081659" w:history="1">
             <w:r>
               <w:rPr>
                 <w:rStyle w:val="Hyperlink"/>
@@ -199,7 +199,7 @@
               <w:rPr>
                 <w:webHidden/>
               </w:rPr>
-              <w:instrText xml:space="preserve"> PAGEREF _Toc140759456 \h </w:instrText>
+              <w:instrText xml:space="preserve"> PAGEREF _Toc141081659 \h </w:instrText>
             </w:r>
             <w:r>
               <w:rPr>
@@ -237,7 +237,7 @@
               <w14:ligatures w14:val="standardContextual"/>
             </w:rPr>
           </w:pPr>
-          <w:hyperlink w:anchor="_Toc140759457" w:history="1">
+          <w:hyperlink w:anchor="_Toc141081660" w:history="1">
             <w:r>
               <w:rPr>
                 <w:rStyle w:val="Hyperlink"/>
@@ -276,7 +276,7 @@
               <w:rPr>
                 <w:webHidden/>
               </w:rPr>
-              <w:instrText xml:space="preserve"> PAGEREF _Toc140759457 \h </w:instrText>
+              <w:instrText xml:space="preserve"> PAGEREF _Toc141081660 \h </w:instrText>
             </w:r>
             <w:r>
               <w:rPr>
@@ -313,7 +313,7 @@
               <w14:ligatures w14:val="standardContextual"/>
             </w:rPr>
           </w:pPr>
-          <w:hyperlink w:anchor="_Toc140759458" w:history="1">
+          <w:hyperlink w:anchor="_Toc141081661" w:history="1">
             <w:r>
               <w:rPr>
                 <w:rStyle w:val="Hyperlink"/>
@@ -351,7 +351,7 @@
               <w:rPr>
                 <w:webHidden/>
               </w:rPr>
-              <w:instrText xml:space="preserve"> PAGEREF _Toc140759458 \h </w:instrText>
+              <w:instrText xml:space="preserve"> PAGEREF _Toc141081661 \h </w:instrText>
             </w:r>
             <w:r>
               <w:rPr>
@@ -388,7 +388,7 @@
               <w14:ligatures w14:val="standardContextual"/>
             </w:rPr>
           </w:pPr>
-          <w:hyperlink w:anchor="_Toc140759459" w:history="1">
+          <w:hyperlink w:anchor="_Toc141081662" w:history="1">
             <w:r>
               <w:rPr>
                 <w:rStyle w:val="Hyperlink"/>
@@ -426,7 +426,7 @@
               <w:rPr>
                 <w:webHidden/>
               </w:rPr>
-              <w:instrText xml:space="preserve"> PAGEREF _Toc140759459 \h </w:instrText>
+              <w:instrText xml:space="preserve"> PAGEREF _Toc141081662 \h </w:instrText>
             </w:r>
             <w:r>
               <w:rPr>
@@ -464,7 +464,7 @@
               <w14:ligatures w14:val="standardContextual"/>
             </w:rPr>
           </w:pPr>
-          <w:hyperlink w:anchor="_Toc140759460" w:history="1">
+          <w:hyperlink w:anchor="_Toc141081663" w:history="1">
             <w:r>
               <w:rPr>
                 <w:rStyle w:val="Hyperlink"/>
@@ -503,7 +503,7 @@
               <w:rPr>
                 <w:webHidden/>
               </w:rPr>
-              <w:instrText xml:space="preserve"> PAGEREF _Toc140759460 \h </w:instrText>
+              <w:instrText xml:space="preserve"> PAGEREF _Toc141081663 \h </w:instrText>
             </w:r>
             <w:r>
               <w:rPr>
@@ -540,7 +540,7 @@
               <w14:ligatures w14:val="standardContextual"/>
             </w:rPr>
           </w:pPr>
-          <w:hyperlink w:anchor="_Toc140759461" w:history="1">
+          <w:hyperlink w:anchor="_Toc141081664" w:history="1">
             <w:r>
               <w:rPr>
                 <w:rStyle w:val="Hyperlink"/>
@@ -578,7 +578,7 @@
               <w:rPr>
                 <w:webHidden/>
               </w:rPr>
-              <w:instrText xml:space="preserve"> PAGEREF _Toc140759461 \h </w:instrText>
+              <w:instrText xml:space="preserve"> PAGEREF _Toc141081664 \h </w:instrText>
             </w:r>
             <w:r>
               <w:rPr>
@@ -615,7 +615,7 @@
               <w14:ligatures w14:val="standardContextual"/>
             </w:rPr>
           </w:pPr>
-          <w:hyperlink w:anchor="_Toc140759462" w:history="1">
+          <w:hyperlink w:anchor="_Toc141081665" w:history="1">
             <w:r>
               <w:rPr>
                 <w:rStyle w:val="Hyperlink"/>
@@ -653,7 +653,7 @@
               <w:rPr>
                 <w:webHidden/>
               </w:rPr>
-              <w:instrText xml:space="preserve"> PAGEREF _Toc140759462 \h </w:instrText>
+              <w:instrText xml:space="preserve"> PAGEREF _Toc141081665 \h </w:instrText>
             </w:r>
             <w:r>
               <w:rPr>
@@ -670,7 +670,7 @@
               <w:rPr>
                 <w:webHidden/>
               </w:rPr>
-              <w:t>7</w:t>
+              <w:t>6</w:t>
             </w:r>
             <w:r>
               <w:rPr>
@@ -690,7 +690,7 @@
               <w14:ligatures w14:val="standardContextual"/>
             </w:rPr>
           </w:pPr>
-          <w:hyperlink w:anchor="_Toc140759463" w:history="1">
+          <w:hyperlink w:anchor="_Toc141081666" w:history="1">
             <w:r>
               <w:rPr>
                 <w:rStyle w:val="Hyperlink"/>
@@ -710,7 +710,7 @@
               <w:rPr>
                 <w:rStyle w:val="Hyperlink"/>
               </w:rPr>
-              <w:t>Infineon PD Logger</w:t>
+              <w:t>Infineon WCS Logger</w:t>
             </w:r>
             <w:r>
               <w:rPr>
@@ -728,7 +728,7 @@
               <w:rPr>
                 <w:webHidden/>
               </w:rPr>
-              <w:instrText xml:space="preserve"> PAGEREF _Toc140759463 \h </w:instrText>
+              <w:instrText xml:space="preserve"> PAGEREF _Toc141081666 \h </w:instrText>
             </w:r>
             <w:r>
               <w:rPr>
@@ -745,7 +745,7 @@
               <w:rPr>
                 <w:webHidden/>
               </w:rPr>
-              <w:t>7</w:t>
+              <w:t>6</w:t>
             </w:r>
             <w:r>
               <w:rPr>
@@ -766,7 +766,7 @@
               <w14:ligatures w14:val="standardContextual"/>
             </w:rPr>
           </w:pPr>
-          <w:hyperlink w:anchor="_Toc140759464" w:history="1">
+          <w:hyperlink w:anchor="_Toc141081667" w:history="1">
             <w:r>
               <w:rPr>
                 <w:rStyle w:val="Hyperlink"/>
@@ -805,7 +805,7 @@
               <w:rPr>
                 <w:webHidden/>
               </w:rPr>
-              <w:instrText xml:space="preserve"> PAGEREF _Toc140759464 \h </w:instrText>
+              <w:instrText xml:space="preserve"> PAGEREF _Toc141081667 \h </w:instrText>
             </w:r>
             <w:r>
               <w:rPr>
@@ -842,7 +842,7 @@
               <w14:ligatures w14:val="standardContextual"/>
             </w:rPr>
           </w:pPr>
-          <w:hyperlink w:anchor="_Toc140759465" w:history="1">
+          <w:hyperlink w:anchor="_Toc141081668" w:history="1">
             <w:r>
               <w:rPr>
                 <w:rStyle w:val="Hyperlink"/>
@@ -880,7 +880,7 @@
               <w:rPr>
                 <w:webHidden/>
               </w:rPr>
-              <w:instrText xml:space="preserve"> PAGEREF _Toc140759465 \h </w:instrText>
+              <w:instrText xml:space="preserve"> PAGEREF _Toc141081668 \h </w:instrText>
             </w:r>
             <w:r>
               <w:rPr>
@@ -917,7 +917,7 @@
               <w14:ligatures w14:val="standardContextual"/>
             </w:rPr>
           </w:pPr>
-          <w:hyperlink w:anchor="_Toc140759466" w:history="1">
+          <w:hyperlink w:anchor="_Toc141081669" w:history="1">
             <w:r>
               <w:rPr>
                 <w:rStyle w:val="Hyperlink"/>
@@ -955,7 +955,7 @@
               <w:rPr>
                 <w:webHidden/>
               </w:rPr>
-              <w:instrText xml:space="preserve"> PAGEREF _Toc140759466 \h </w:instrText>
+              <w:instrText xml:space="preserve"> PAGEREF _Toc141081669 \h </w:instrText>
             </w:r>
             <w:r>
               <w:rPr>
@@ -993,7 +993,7 @@
               <w14:ligatures w14:val="standardContextual"/>
             </w:rPr>
           </w:pPr>
-          <w:hyperlink w:anchor="_Toc140759467" w:history="1">
+          <w:hyperlink w:anchor="_Toc141081670" w:history="1">
             <w:r>
               <w:rPr>
                 <w:rStyle w:val="Hyperlink"/>
@@ -1014,7 +1014,7 @@
               <w:rPr>
                 <w:rStyle w:val="Hyperlink"/>
               </w:rPr>
-              <w:t>Limitations of Infineon PD Logger</w:t>
+              <w:t>Limitations of Infineon WCS Logger</w:t>
             </w:r>
             <w:r>
               <w:rPr>
@@ -1032,7 +1032,7 @@
               <w:rPr>
                 <w:webHidden/>
               </w:rPr>
-              <w:instrText xml:space="preserve"> PAGEREF _Toc140759467 \h </w:instrText>
+              <w:instrText xml:space="preserve"> PAGEREF _Toc141081670 \h </w:instrText>
             </w:r>
             <w:r>
               <w:rPr>
@@ -1070,7 +1070,7 @@
               <w14:ligatures w14:val="standardContextual"/>
             </w:rPr>
           </w:pPr>
-          <w:hyperlink w:anchor="_Toc140759468" w:history="1">
+          <w:hyperlink w:anchor="_Toc141081671" w:history="1">
             <w:r>
               <w:rPr>
                 <w:rStyle w:val="Hyperlink"/>
@@ -1093,7 +1093,7 @@
               <w:rPr>
                 <w:webHidden/>
               </w:rPr>
-              <w:instrText xml:space="preserve"> PAGEREF _Toc140759468 \h </w:instrText>
+              <w:instrText xml:space="preserve"> PAGEREF _Toc141081671 \h </w:instrText>
             </w:r>
             <w:r>
               <w:rPr>
@@ -1131,7 +1131,7 @@
               <w14:ligatures w14:val="standardContextual"/>
             </w:rPr>
           </w:pPr>
-          <w:hyperlink w:anchor="_Toc140759469" w:history="1">
+          <w:hyperlink w:anchor="_Toc141081672" w:history="1">
             <w:r>
               <w:rPr>
                 <w:rStyle w:val="Hyperlink"/>
@@ -1154,7 +1154,7 @@
               <w:rPr>
                 <w:webHidden/>
               </w:rPr>
-              <w:instrText xml:space="preserve"> PAGEREF _Toc140759469 \h </w:instrText>
+              <w:instrText xml:space="preserve"> PAGEREF _Toc141081672 \h </w:instrText>
             </w:r>
             <w:r>
               <w:rPr>
@@ -1272,7 +1272,7 @@
           <w:lang w:val="en-GB"/>
         </w:rPr>
       </w:pPr>
-      <w:bookmarkStart w:id="5" w:name="_Toc140759457"/>
+      <w:bookmarkStart w:id="5" w:name="_Toc141081660"/>
       <w:r>
         <w:rPr>
           <w:lang w:val="en-GB"/>
@@ -1308,33 +1308,6 @@
           <w:lang w:val="en-GB"/>
         </w:rPr>
         <w:t xml:space="preserve">Infineon WCS CCG devices are commonly used in PD port controller applications in systems like Notebook and Desktop computers, tablets, mobiles etc. In such cases, the system design typically includes a Host Processor or Embedded Controller (EC) that is responsible for the system policy decisions. The CCG controller can be connected to the EC and the CCG firmware allows the EC to monitor the status of the USB-PD ports, change configurations, perform firmware updates, and transparently interact with other USB-PD devices connected to CCG. All the capabilities are exercised through commands/responses transferred across the Host Processor Interface (HPI). </w:t>
-      </w:r>
-    </w:p>
-    <w:p>
-      <w:pPr>
-        <w:pStyle w:val="Body"/>
-        <w:rPr>
-          <w:lang w:val="en-GB"/>
-        </w:rPr>
-      </w:pPr>
-      <w:r>
-        <w:rPr>
-          <w:lang w:val="en-GB"/>
-        </w:rPr>
-        <w:t>As results, it is mandatory to inspect HPI activities when working in issue analysis and debugging, apart from checking CC logs alone. This tool is aimed to facilitate users to collect all necessary trace logs through Saleae Logic Analyser, a 3</w:t>
-      </w:r>
-      <w:r>
-        <w:rPr>
-          <w:vertAlign w:val="superscript"/>
-          <w:lang w:val="en-GB"/>
-        </w:rPr>
-        <w:t>rd</w:t>
-      </w:r>
-      <w:r>
-        <w:rPr>
-          <w:lang w:val="en-GB"/>
-        </w:rPr>
-        <w:t xml:space="preserve"> party logic analyser supports up to 16 logical channels, as the standard debug procedures in collaborating with Infineon WCS support teams.</w:t>
       </w:r>
     </w:p>
     <w:p>
@@ -1380,14 +1353,13 @@
             </w:pPr>
             <w:r>
               <w:rPr>
-                <w:noProof/>
                 <w:lang w:val="en-GB"/>
               </w:rPr>
               <w:drawing>
-                <wp:inline distT="0" distB="0" distL="0" distR="0" wp14:anchorId="785FD07D" wp14:editId="15808719">
-                  <wp:extent cx="6480000" cy="2678400"/>
-                  <wp:effectExtent l="0" t="0" r="0" b="8255"/>
-                  <wp:docPr id="7" name="Picture 7" descr="WCS E2 training"/>
+                <wp:inline distT="0" distB="0" distL="0" distR="0" wp14:anchorId="290B1E7D" wp14:editId="2A9D7D46">
+                  <wp:extent cx="6480810" cy="4492625"/>
+                  <wp:effectExtent l="0" t="0" r="0" b="3175"/>
+                  <wp:docPr id="13" name="Picture 13"/>
                   <wp:cNvGraphicFramePr>
                     <a:graphicFrameLocks xmlns:a="http://schemas.openxmlformats.org/drawingml/2006/main" noChangeAspect="1"/>
                   </wp:cNvGraphicFramePr>
@@ -1395,33 +1367,23 @@
                     <a:graphicData uri="http://schemas.openxmlformats.org/drawingml/2006/picture">
                       <pic:pic xmlns:pic="http://schemas.openxmlformats.org/drawingml/2006/picture">
                         <pic:nvPicPr>
-                          <pic:cNvPr id="7" name="Picture 7" descr="WCS E2 training"/>
-                          <pic:cNvPicPr>
-                            <a:picLocks noChangeAspect="1" noChangeArrowheads="1"/>
-                          </pic:cNvPicPr>
+                          <pic:cNvPr id="1" name=""/>
+                          <pic:cNvPicPr/>
                         </pic:nvPicPr>
                         <pic:blipFill>
-                          <a:blip r:embed="rId13" cstate="print">
-                            <a:extLst>
-                              <a:ext uri="{28A0092B-C50C-407E-A947-70E740481C1C}">
-                                <a14:useLocalDpi xmlns:a14="http://schemas.microsoft.com/office/drawing/2010/main" val="0"/>
-                              </a:ext>
-                            </a:extLst>
-                          </a:blip>
-                          <a:srcRect/>
+                          <a:blip r:embed="rId13"/>
                           <a:stretch>
                             <a:fillRect/>
                           </a:stretch>
                         </pic:blipFill>
-                        <pic:spPr bwMode="auto">
+                        <pic:spPr>
                           <a:xfrm>
                             <a:off x="0" y="0"/>
-                            <a:ext cx="6480000" cy="2678400"/>
+                            <a:ext cx="6480810" cy="4492625"/>
                           </a:xfrm>
                           <a:prstGeom prst="rect">
                             <a:avLst/>
                           </a:prstGeom>
-                          <a:noFill/>
                         </pic:spPr>
                       </pic:pic>
                     </a:graphicData>
@@ -1453,7 +1415,7 @@
         <w:rPr>
           <w:lang w:val="en-GB"/>
         </w:rPr>
-        <w:t>WCS PD Host E2 training</w:t>
+        <w:t>Standard issue report flow</w:t>
       </w:r>
     </w:p>
     <w:p>
@@ -1464,7 +1426,7 @@
         </w:rPr>
       </w:pPr>
       <w:bookmarkStart w:id="6" w:name="_Toc137461256"/>
-      <w:bookmarkStart w:id="7" w:name="_Toc140759458"/>
+      <w:bookmarkStart w:id="7" w:name="_Toc141081661"/>
       <w:r>
         <w:rPr>
           <w:lang w:val="en-GB"/>
@@ -1521,7 +1483,19 @@
         <w:rPr>
           <w:lang w:val="en-GB"/>
         </w:rPr>
-        <w:t>Saleae Logic 2 application v2.4.0 or above</w:t>
+        <w:t xml:space="preserve">Saleae </w:t>
+      </w:r>
+      <w:r>
+        <w:rPr>
+          <w:lang w:val="en-GB"/>
+        </w:rPr>
+        <w:t>Logic2</w:t>
+      </w:r>
+      <w:r>
+        <w:rPr>
+          <w:lang w:val="en-GB"/>
+        </w:rPr>
+        <w:t xml:space="preserve"> application v2.4.0 or above</w:t>
       </w:r>
     </w:p>
     <w:p>
@@ -1539,7 +1513,7 @@
         <w:rPr>
           <w:lang w:val="en-GB"/>
         </w:rPr>
-        <w:t>Infineon CYPD4500 PD3.0 CC Sniffer (optional)</w:t>
+        <w:t>Infineon CYPD4500 PD3.0 CC Sniffer</w:t>
       </w:r>
     </w:p>
     <w:p>
@@ -1557,7 +1531,7 @@
         <w:rPr>
           <w:lang w:val="en-GB"/>
         </w:rPr>
-        <w:t>Infineon CYPD4500 EZ-PD Protocol Analyser Utility (optional)</w:t>
+        <w:t>Infineon EZ-PD Protocol Analyser Utility</w:t>
       </w:r>
     </w:p>
     <w:p>
@@ -1567,18 +1541,11 @@
           <w:lang w:val="en-GB"/>
         </w:rPr>
       </w:pPr>
-    </w:p>
-    <w:p>
-      <w:pPr>
-        <w:pStyle w:val="Body"/>
-        <w:rPr>
-          <w:lang w:val="en-GB"/>
-        </w:rPr>
-      </w:pPr>
-      <w:r>
-        <w:rPr>
-          <w:lang w:val="en-GB"/>
-        </w:rPr>
+      <w:r>
+        <w:rPr>
+          <w:lang w:val="en-GB"/>
+        </w:rPr>
+        <w:lastRenderedPageBreak/>
         <w:t>Infineon WCS support team creates a tool package to facilitate and standardise log collection activities. It includes:</w:t>
       </w:r>
     </w:p>
@@ -1638,7 +1605,6 @@
           <w:bCs/>
           <w:lang w:val="en-GB"/>
         </w:rPr>
-        <w:lastRenderedPageBreak/>
         <w:t>CC Analyser</w:t>
       </w:r>
       <w:r>
@@ -1665,13 +1631,25 @@
           <w:bCs/>
           <w:lang w:val="en-GB"/>
         </w:rPr>
-        <w:t>Infineon PD Logger</w:t>
-      </w:r>
-      <w:r>
-        <w:rPr>
-          <w:lang w:val="en-GB"/>
-        </w:rPr>
-        <w:t>: a python-base GUI tool to generate SALEAE logs with all necessary information described as WCS PD Host E2 training table in Figure 1.</w:t>
+        <w:t>Infineon WCS Logger</w:t>
+      </w:r>
+      <w:r>
+        <w:rPr>
+          <w:lang w:val="en-GB"/>
+        </w:rPr>
+        <w:t>: a python-base GUI tool to generate SALEAE logs with all necessary information described as WCS PD Host E2 trainin</w:t>
+      </w:r>
+      <w:r>
+        <w:rPr>
+          <w:lang w:val="en-GB"/>
+        </w:rPr>
+        <w:t>g</w:t>
+      </w:r>
+      <w:r>
+        <w:rPr>
+          <w:lang w:val="en-GB"/>
+        </w:rPr>
+        <w:t>.</w:t>
       </w:r>
     </w:p>
     <w:p>
@@ -1694,7 +1672,7 @@
       <w:bookmarkStart w:id="10" w:name="_Toc430004435"/>
       <w:bookmarkStart w:id="11" w:name="_Toc468357354"/>
       <w:bookmarkStart w:id="12" w:name="_Toc137461257"/>
-      <w:bookmarkStart w:id="13" w:name="_Toc140759459"/>
+      <w:bookmarkStart w:id="13" w:name="_Toc141081662"/>
       <w:r>
         <w:rPr>
           <w:lang w:val="en-GB"/>
@@ -1739,7 +1717,19 @@
         <w:rPr>
           <w:lang w:val="en-GB"/>
         </w:rPr>
-        <w:t>Install Saleae Logic 2 application and enable “Automation” via Preference -&gt; Automation -&gt; Enable Automation Server.</w:t>
+        <w:t xml:space="preserve">Install Saleae </w:t>
+      </w:r>
+      <w:r>
+        <w:rPr>
+          <w:lang w:val="en-GB"/>
+        </w:rPr>
+        <w:t>Logic2</w:t>
+      </w:r>
+      <w:r>
+        <w:rPr>
+          <w:lang w:val="en-GB"/>
+        </w:rPr>
+        <w:t xml:space="preserve"> application and enable “Automation” via Preference -&gt; Automation -&gt; Enable Automation Server.</w:t>
       </w:r>
     </w:p>
     <w:p>
@@ -2178,61 +2168,63 @@
         </w:tabs>
         <w:ind w:left="1418" w:hanging="1418"/>
         <w:jc w:val="center"/>
-        <w:rPr>
-          <w:lang w:val="en-GB"/>
-        </w:rPr>
-      </w:pPr>
-      <w:r>
-        <w:rPr>
-          <w:lang w:val="en-GB"/>
-        </w:rPr>
-        <w:t>Saleae Logic 2 Preferences</w:t>
+      </w:pPr>
+      <w:r>
+        <w:rPr>
+          <w:lang w:val="en-GB"/>
+        </w:rPr>
+        <w:t xml:space="preserve">Saleae </w:t>
+      </w:r>
+      <w:r>
+        <w:rPr>
+          <w:lang w:val="en-GB"/>
+        </w:rPr>
+        <w:t>Logic2</w:t>
+      </w:r>
+      <w:r>
+        <w:rPr>
+          <w:lang w:val="en-GB"/>
+        </w:rPr>
+        <w:t xml:space="preserve"> Preferences</w:t>
+      </w:r>
+      <w:r>
+        <w:br w:type="page"/>
       </w:r>
     </w:p>
     <w:p>
       <w:pPr>
-        <w:rPr>
-          <w:lang w:eastAsia="de-DE"/>
-        </w:rPr>
-      </w:pPr>
-      <w:r>
-        <w:br w:type="page"/>
+        <w:pStyle w:val="Heading1"/>
+        <w:rPr>
+          <w:lang w:val="en-GB"/>
+        </w:rPr>
+      </w:pPr>
+      <w:bookmarkStart w:id="14" w:name="_Toc137461258"/>
+      <w:bookmarkStart w:id="15" w:name="_Toc141081663"/>
+      <w:r>
+        <w:rPr>
+          <w:lang w:val="en-GB"/>
+        </w:rPr>
+        <w:lastRenderedPageBreak/>
+        <w:t>Infineon Automation Tool Package</w:t>
+      </w:r>
+      <w:bookmarkEnd w:id="14"/>
+      <w:bookmarkEnd w:id="15"/>
+      <w:r>
+        <w:rPr>
+          <w:lang w:val="en-GB"/>
+        </w:rPr>
+        <w:t xml:space="preserve"> </w:t>
       </w:r>
     </w:p>
     <w:p>
       <w:pPr>
-        <w:pStyle w:val="Heading1"/>
-        <w:rPr>
-          <w:lang w:val="en-GB"/>
-        </w:rPr>
-      </w:pPr>
-      <w:bookmarkStart w:id="14" w:name="_Toc137461258"/>
-      <w:bookmarkStart w:id="15" w:name="_Toc140759460"/>
-      <w:r>
-        <w:rPr>
-          <w:lang w:val="en-GB"/>
-        </w:rPr>
-        <w:lastRenderedPageBreak/>
-        <w:t>Infineon Automation Tool Package</w:t>
-      </w:r>
-      <w:bookmarkEnd w:id="14"/>
-      <w:bookmarkEnd w:id="15"/>
-      <w:r>
-        <w:rPr>
-          <w:lang w:val="en-GB"/>
-        </w:rPr>
-        <w:t xml:space="preserve"> </w:t>
-      </w:r>
-    </w:p>
-    <w:p>
-      <w:pPr>
         <w:pStyle w:val="Heading2"/>
         <w:rPr>
           <w:lang w:val="en-GB"/>
         </w:rPr>
       </w:pPr>
       <w:bookmarkStart w:id="16" w:name="_Toc137461259"/>
-      <w:bookmarkStart w:id="17" w:name="_Toc140759461"/>
+      <w:bookmarkStart w:id="17" w:name="_Toc141081664"/>
       <w:r>
         <w:rPr>
           <w:lang w:val="en-GB"/>
@@ -2266,7 +2258,19 @@
         <w:rPr>
           <w:lang w:val="en-GB"/>
         </w:rPr>
-        <w:t>C Analysers in Saleae Logic 2 application can decode and list bus messages to its terminal-like window and tabular-format table for search usage. It decodes I</w:t>
+        <w:t xml:space="preserve">C Analysers in Saleae </w:t>
+      </w:r>
+      <w:r>
+        <w:rPr>
+          <w:lang w:val="en-GB"/>
+        </w:rPr>
+        <w:t>Logic2</w:t>
+      </w:r>
+      <w:r>
+        <w:rPr>
+          <w:lang w:val="en-GB"/>
+        </w:rPr>
+        <w:t xml:space="preserve"> application can decode and list bus messages to its terminal-like window and tabular-format table for search usage. It decodes I</w:t>
       </w:r>
       <w:r>
         <w:rPr>
@@ -2436,9 +2440,9 @@
                 <w:lang w:val="en-GB"/>
               </w:rPr>
               <w:drawing>
-                <wp:inline distT="0" distB="0" distL="0" distR="0" wp14:anchorId="363F7888" wp14:editId="1C2DEB9E">
-                  <wp:extent cx="5400000" cy="4471200"/>
-                  <wp:effectExtent l="0" t="0" r="0" b="5715"/>
+                <wp:inline distT="0" distB="0" distL="0" distR="0" wp14:anchorId="363F7888" wp14:editId="6EBE2330">
+                  <wp:extent cx="4320000" cy="3578400"/>
+                  <wp:effectExtent l="0" t="0" r="4445" b="3175"/>
                   <wp:docPr id="40" name="Picture 40" descr="A screenshot of a computer program&#10;&#10;Description automatically generated with medium confidence"/>
                   <wp:cNvGraphicFramePr>
                     <a:graphicFrameLocks xmlns:a="http://schemas.openxmlformats.org/drawingml/2006/main" noChangeAspect="1"/>
@@ -2459,7 +2463,7 @@
                         <pic:spPr>
                           <a:xfrm>
                             <a:off x="0" y="0"/>
-                            <a:ext cx="5400000" cy="4471200"/>
+                            <a:ext cx="4320000" cy="3578400"/>
                           </a:xfrm>
                           <a:prstGeom prst="rect">
                             <a:avLst/>
@@ -2554,11 +2558,10 @@
                 <w:noProof/>
                 <w:lang w:val="en-GB"/>
               </w:rPr>
-              <w:lastRenderedPageBreak/>
               <w:drawing>
-                <wp:inline distT="0" distB="0" distL="0" distR="0" wp14:anchorId="620A08E0" wp14:editId="28B3F182">
-                  <wp:extent cx="6480000" cy="1857600"/>
-                  <wp:effectExtent l="0" t="0" r="0" b="9525"/>
+                <wp:inline distT="0" distB="0" distL="0" distR="0" wp14:anchorId="620A08E0" wp14:editId="2BB6C6DF">
+                  <wp:extent cx="5400000" cy="1548000"/>
+                  <wp:effectExtent l="0" t="0" r="0" b="0"/>
                   <wp:docPr id="24" name="Picture 24"/>
                   <wp:cNvGraphicFramePr>
                     <a:graphicFrameLocks xmlns:a="http://schemas.openxmlformats.org/drawingml/2006/main" noChangeAspect="1"/>
@@ -2579,7 +2582,7 @@
                         <pic:spPr>
                           <a:xfrm>
                             <a:off x="0" y="0"/>
-                            <a:ext cx="6480000" cy="1857600"/>
+                            <a:ext cx="5400000" cy="1548000"/>
                           </a:xfrm>
                           <a:prstGeom prst="rect">
                             <a:avLst/>
@@ -2599,11 +2602,20 @@
                 <w:lang w:val="en-GB"/>
               </w:rPr>
             </w:pPr>
+          </w:p>
+          <w:p>
+            <w:pPr>
+              <w:pStyle w:val="TableCell-c"/>
+              <w:rPr>
+                <w:lang w:val="en-GB"/>
+              </w:rPr>
+            </w:pPr>
             <w:r>
               <w:rPr>
                 <w:noProof/>
                 <w:lang w:val="en-GB"/>
               </w:rPr>
+              <w:lastRenderedPageBreak/>
               <w:drawing>
                 <wp:inline distT="0" distB="0" distL="0" distR="0" wp14:anchorId="540A7004" wp14:editId="15224338">
                   <wp:extent cx="5400000" cy="2278800"/>
@@ -2685,233 +2697,19 @@
         <w:t xml:space="preserve"> (grey)</w:t>
       </w:r>
     </w:p>
-    <w:tbl>
-      <w:tblPr>
-        <w:tblStyle w:val="InfineonPicture"/>
-        <w:tblW w:w="5000" w:type="pct"/>
-        <w:tblBorders>
-          <w:top w:val="none" w:sz="0" w:space="0" w:color="auto"/>
-          <w:left w:val="none" w:sz="0" w:space="0" w:color="auto"/>
-          <w:bottom w:val="none" w:sz="0" w:space="0" w:color="auto"/>
-          <w:right w:val="none" w:sz="0" w:space="0" w:color="auto"/>
-          <w:insideH w:val="none" w:sz="0" w:space="0" w:color="auto"/>
-          <w:insideV w:val="none" w:sz="0" w:space="0" w:color="auto"/>
-        </w:tblBorders>
-        <w:tblCellMar>
-          <w:left w:w="0" w:type="dxa"/>
-          <w:right w:w="0" w:type="dxa"/>
-        </w:tblCellMar>
-        <w:tblLook w:val="05E0" w:firstRow="1" w:lastRow="1" w:firstColumn="1" w:lastColumn="1" w:noHBand="0" w:noVBand="1"/>
-      </w:tblPr>
-      <w:tblGrid>
-        <w:gridCol w:w="10206"/>
-      </w:tblGrid>
-      <w:tr>
-        <w:tc>
-          <w:tcPr>
-            <w:tcW w:w="5000" w:type="pct"/>
-          </w:tcPr>
-          <w:p>
-            <w:pPr>
-              <w:pStyle w:val="TableCell-c"/>
-              <w:rPr>
-                <w:lang w:val="en-GB"/>
-              </w:rPr>
-            </w:pPr>
-            <w:r>
-              <w:rPr>
-                <w:noProof/>
-                <w:lang w:val="en-GB"/>
-              </w:rPr>
-              <w:drawing>
-                <wp:inline distT="0" distB="0" distL="0" distR="0" wp14:anchorId="09F70B5D" wp14:editId="5222B2A7">
-                  <wp:extent cx="6480000" cy="1454400"/>
-                  <wp:effectExtent l="0" t="0" r="0" b="0"/>
-                  <wp:docPr id="45" name="Picture 45"/>
-                  <wp:cNvGraphicFramePr>
-                    <a:graphicFrameLocks xmlns:a="http://schemas.openxmlformats.org/drawingml/2006/main" noChangeAspect="1"/>
-                  </wp:cNvGraphicFramePr>
-                  <a:graphic xmlns:a="http://schemas.openxmlformats.org/drawingml/2006/main">
-                    <a:graphicData uri="http://schemas.openxmlformats.org/drawingml/2006/picture">
-                      <pic:pic xmlns:pic="http://schemas.openxmlformats.org/drawingml/2006/picture">
-                        <pic:nvPicPr>
-                          <pic:cNvPr id="1" name=""/>
-                          <pic:cNvPicPr/>
-                        </pic:nvPicPr>
-                        <pic:blipFill>
-                          <a:blip r:embed="rId18"/>
-                          <a:stretch>
-                            <a:fillRect/>
-                          </a:stretch>
-                        </pic:blipFill>
-                        <pic:spPr>
-                          <a:xfrm>
-                            <a:off x="0" y="0"/>
-                            <a:ext cx="6480000" cy="1454400"/>
-                          </a:xfrm>
-                          <a:prstGeom prst="rect">
-                            <a:avLst/>
-                          </a:prstGeom>
-                        </pic:spPr>
-                      </pic:pic>
-                    </a:graphicData>
-                  </a:graphic>
-                </wp:inline>
-              </w:drawing>
-            </w:r>
-          </w:p>
-        </w:tc>
-      </w:tr>
-      <w:tr>
-        <w:tc>
-          <w:tcPr>
-            <w:tcW w:w="5000" w:type="pct"/>
-          </w:tcPr>
-          <w:p>
-            <w:pPr>
-              <w:pStyle w:val="TableCell-c"/>
-              <w:rPr>
-                <w:lang w:val="en-GB"/>
-              </w:rPr>
-            </w:pPr>
-            <w:r>
-              <w:rPr>
-                <w:noProof/>
-                <w:lang w:val="en-GB"/>
-              </w:rPr>
-              <w:drawing>
-                <wp:inline distT="0" distB="0" distL="0" distR="0" wp14:anchorId="021A323A" wp14:editId="5311192F">
-                  <wp:extent cx="6480000" cy="1036800"/>
-                  <wp:effectExtent l="0" t="0" r="0" b="0"/>
-                  <wp:docPr id="46" name="Picture 46"/>
-                  <wp:cNvGraphicFramePr>
-                    <a:graphicFrameLocks xmlns:a="http://schemas.openxmlformats.org/drawingml/2006/main" noChangeAspect="1"/>
-                  </wp:cNvGraphicFramePr>
-                  <a:graphic xmlns:a="http://schemas.openxmlformats.org/drawingml/2006/main">
-                    <a:graphicData uri="http://schemas.openxmlformats.org/drawingml/2006/picture">
-                      <pic:pic xmlns:pic="http://schemas.openxmlformats.org/drawingml/2006/picture">
-                        <pic:nvPicPr>
-                          <pic:cNvPr id="1" name=""/>
-                          <pic:cNvPicPr/>
-                        </pic:nvPicPr>
-                        <pic:blipFill>
-                          <a:blip r:embed="rId19"/>
-                          <a:stretch>
-                            <a:fillRect/>
-                          </a:stretch>
-                        </pic:blipFill>
-                        <pic:spPr>
-                          <a:xfrm>
-                            <a:off x="0" y="0"/>
-                            <a:ext cx="6480000" cy="1036800"/>
-                          </a:xfrm>
-                          <a:prstGeom prst="rect">
-                            <a:avLst/>
-                          </a:prstGeom>
-                        </pic:spPr>
-                      </pic:pic>
-                    </a:graphicData>
-                  </a:graphic>
-                </wp:inline>
-              </w:drawing>
-            </w:r>
-          </w:p>
-        </w:tc>
-      </w:tr>
-      <w:tr>
-        <w:tc>
-          <w:tcPr>
-            <w:tcW w:w="5000" w:type="pct"/>
-          </w:tcPr>
-          <w:p>
-            <w:pPr>
-              <w:pStyle w:val="TableCell-c"/>
-              <w:rPr>
-                <w:lang w:val="en-GB"/>
-              </w:rPr>
-            </w:pPr>
-            <w:r>
-              <w:rPr>
-                <w:noProof/>
-                <w:lang w:val="en-GB"/>
-              </w:rPr>
-              <w:drawing>
-                <wp:inline distT="0" distB="0" distL="0" distR="0" wp14:anchorId="0547FDC0" wp14:editId="19FC6B4B">
-                  <wp:extent cx="6480000" cy="1440000"/>
-                  <wp:effectExtent l="0" t="0" r="0" b="8255"/>
-                  <wp:docPr id="47" name="Picture 47"/>
-                  <wp:cNvGraphicFramePr>
-                    <a:graphicFrameLocks xmlns:a="http://schemas.openxmlformats.org/drawingml/2006/main" noChangeAspect="1"/>
-                  </wp:cNvGraphicFramePr>
-                  <a:graphic xmlns:a="http://schemas.openxmlformats.org/drawingml/2006/main">
-                    <a:graphicData uri="http://schemas.openxmlformats.org/drawingml/2006/picture">
-                      <pic:pic xmlns:pic="http://schemas.openxmlformats.org/drawingml/2006/picture">
-                        <pic:nvPicPr>
-                          <pic:cNvPr id="1" name=""/>
-                          <pic:cNvPicPr/>
-                        </pic:nvPicPr>
-                        <pic:blipFill>
-                          <a:blip r:embed="rId20"/>
-                          <a:stretch>
-                            <a:fillRect/>
-                          </a:stretch>
-                        </pic:blipFill>
-                        <pic:spPr>
-                          <a:xfrm>
-                            <a:off x="0" y="0"/>
-                            <a:ext cx="6480000" cy="1440000"/>
-                          </a:xfrm>
-                          <a:prstGeom prst="rect">
-                            <a:avLst/>
-                          </a:prstGeom>
-                        </pic:spPr>
-                      </pic:pic>
-                    </a:graphicData>
-                  </a:graphic>
-                </wp:inline>
-              </w:drawing>
-            </w:r>
-          </w:p>
-        </w:tc>
-      </w:tr>
-    </w:tbl>
     <w:p>
       <w:pPr>
-        <w:pStyle w:val="FigureTitle"/>
-        <w:numPr>
-          <w:ilvl w:val="0"/>
-          <w:numId w:val="7"/>
-        </w:numPr>
-        <w:tabs>
-          <w:tab w:val="num" w:pos="1418"/>
-        </w:tabs>
-        <w:ind w:left="1418" w:hanging="1418"/>
-        <w:jc w:val="center"/>
-        <w:rPr>
-          <w:lang w:val="en-GB"/>
-        </w:rPr>
-      </w:pPr>
-      <w:r>
-        <w:rPr>
-          <w:lang w:val="en-GB"/>
-        </w:rPr>
-        <w:t>Side-by-side comparison</w:t>
-      </w:r>
-    </w:p>
-    <w:p>
-      <w:pPr>
         <w:pStyle w:val="Heading2"/>
         <w:rPr>
           <w:lang w:val="en-GB"/>
         </w:rPr>
       </w:pPr>
       <w:bookmarkStart w:id="18" w:name="_Toc137461260"/>
-      <w:bookmarkStart w:id="19" w:name="_Toc140759462"/>
-      <w:r>
-        <w:rPr>
-          <w:lang w:val="en-GB"/>
-        </w:rPr>
-        <w:lastRenderedPageBreak/>
+      <w:bookmarkStart w:id="19" w:name="_Toc141081665"/>
+      <w:r>
+        <w:rPr>
+          <w:lang w:val="en-GB"/>
+        </w:rPr>
         <w:t>CC Analyser</w:t>
       </w:r>
       <w:bookmarkEnd w:id="18"/>
@@ -2942,7 +2740,19 @@
         <w:rPr>
           <w:lang w:val="en-GB"/>
         </w:rPr>
-        <w:t>By introducing Infineon CC Analyser with a proper configuration, users can capture and decode both USB CC and HPI logs through Saleae Logic 2 application alone. It is extremely useful to check relevant command sequences across different protocols and accelerate debugging progress.</w:t>
+        <w:t xml:space="preserve">By introducing Infineon CC Analyser with a proper configuration, users can capture and decode both USB CC and HPI logs through Saleae </w:t>
+      </w:r>
+      <w:r>
+        <w:rPr>
+          <w:lang w:val="en-GB"/>
+        </w:rPr>
+        <w:t>Logic2</w:t>
+      </w:r>
+      <w:r>
+        <w:rPr>
+          <w:lang w:val="en-GB"/>
+        </w:rPr>
+        <w:t xml:space="preserve"> application alone. It is extremely useful to check relevant command sequences across different protocols and accelerate debugging progress.</w:t>
       </w:r>
     </w:p>
     <w:tbl>
@@ -2984,9 +2794,9 @@
                 <w:lang w:val="en-GB"/>
               </w:rPr>
               <w:drawing>
-                <wp:inline distT="0" distB="0" distL="0" distR="0" wp14:anchorId="5FCB0FE5" wp14:editId="7093DCA8">
-                  <wp:extent cx="5400000" cy="2811600"/>
-                  <wp:effectExtent l="0" t="0" r="0" b="8255"/>
+                <wp:inline distT="0" distB="0" distL="0" distR="0" wp14:anchorId="5FCB0FE5" wp14:editId="2EBD7223">
+                  <wp:extent cx="4320000" cy="2250000"/>
+                  <wp:effectExtent l="0" t="0" r="4445" b="0"/>
                   <wp:docPr id="41" name="Picture 41" descr="A screenshot of a computer&#10;&#10;Description automatically generated with medium confidence"/>
                   <wp:cNvGraphicFramePr>
                     <a:graphicFrameLocks xmlns:a="http://schemas.openxmlformats.org/drawingml/2006/main" noChangeAspect="1"/>
@@ -2999,7 +2809,7 @@
                           <pic:cNvPicPr/>
                         </pic:nvPicPr>
                         <pic:blipFill>
-                          <a:blip r:embed="rId21"/>
+                          <a:blip r:embed="rId18"/>
                           <a:stretch>
                             <a:fillRect/>
                           </a:stretch>
@@ -3007,7 +2817,7 @@
                         <pic:spPr>
                           <a:xfrm>
                             <a:off x="0" y="0"/>
-                            <a:ext cx="5400000" cy="2811600"/>
+                            <a:ext cx="4320000" cy="2250000"/>
                           </a:xfrm>
                           <a:prstGeom prst="rect">
                             <a:avLst/>
@@ -3054,12 +2864,24 @@
         </w:rPr>
       </w:pPr>
       <w:bookmarkStart w:id="20" w:name="_Toc137461261"/>
-      <w:bookmarkStart w:id="21" w:name="_Toc140759463"/>
-      <w:r>
-        <w:rPr>
-          <w:lang w:val="en-GB"/>
-        </w:rPr>
-        <w:t>Infineon PD Logger</w:t>
+      <w:bookmarkStart w:id="21" w:name="_Toc141081666"/>
+      <w:r>
+        <w:rPr>
+          <w:lang w:val="en-GB"/>
+        </w:rPr>
+        <w:t xml:space="preserve">Infineon </w:t>
+      </w:r>
+      <w:r>
+        <w:rPr>
+          <w:lang w:val="en-GB"/>
+        </w:rPr>
+        <w:t>WCS</w:t>
+      </w:r>
+      <w:r>
+        <w:rPr>
+          <w:lang w:val="en-GB"/>
+        </w:rPr>
+        <w:t xml:space="preserve"> Logger</w:t>
       </w:r>
       <w:bookmarkEnd w:id="20"/>
       <w:bookmarkEnd w:id="21"/>
@@ -3075,349 +2897,8 @@
         <w:rPr>
           <w:lang w:val="en-GB"/>
         </w:rPr>
-        <w:t>This is a portable Python application that supports Microsoft Windows 10 and above. It is highly recommended to use it with Saleae Logic Analyser Pro 16. The application pre-defines all necessary trace pins that users are required to provide while reporting issues for both AMD and INTEL design cases, along with project-relevant information, such as PD firmware revision. All numbers in pulldown menus are selectable but cannot be duplicated.</w:t>
-      </w:r>
-    </w:p>
-    <w:p>
-      <w:pPr>
-        <w:pStyle w:val="Body"/>
-        <w:rPr>
-          <w:lang w:val="en-GB"/>
-        </w:rPr>
-      </w:pPr>
-      <w:r>
-        <w:rPr>
-          <w:lang w:val="en-GB"/>
-        </w:rPr>
-        <w:t xml:space="preserve">A folder named by current date will be created with all generated files, includes SALEAE logs and issue tracker form. </w:t>
-      </w:r>
-      <w:r>
-        <w:rPr>
-          <w:lang w:val="en-GB"/>
-        </w:rPr>
-        <w:t xml:space="preserve">A SALEAE log file </w:t>
-      </w:r>
-      <w:r>
-        <w:rPr>
-          <w:lang w:val="en-GB"/>
-        </w:rPr>
-        <w:t xml:space="preserve">is also </w:t>
-      </w:r>
-      <w:r>
-        <w:rPr>
-          <w:lang w:val="en-GB"/>
-        </w:rPr>
-        <w:t>generated based on channel number settings, associated with corresponding bus analysers respectively. The file will be named beginning with DATE_TIME as a prefix and appended with all data in the Version Information section. In addition, a text file named by the current date will be outputted under the same folder as the log files</w:t>
-      </w:r>
-      <w:r>
-        <w:rPr>
-          <w:lang w:val="en-GB"/>
-        </w:rPr>
-        <w:t>.</w:t>
-      </w:r>
-    </w:p>
-    <w:p>
-      <w:pPr>
-        <w:pStyle w:val="Body"/>
-        <w:rPr>
-          <w:lang w:val="en-GB"/>
-        </w:rPr>
-      </w:pPr>
-      <w:r>
-        <w:rPr>
-          <w:lang w:val="en-GB"/>
-        </w:rPr>
-        <w:t xml:space="preserve">The Main window splits in following sections (refer to Figure </w:t>
-      </w:r>
-      <w:r>
-        <w:rPr>
-          <w:lang w:val="en-GB"/>
-        </w:rPr>
-        <w:t>7</w:t>
-      </w:r>
-      <w:r>
-        <w:rPr>
-          <w:lang w:val="en-GB"/>
-        </w:rPr>
-        <w:t>):</w:t>
-      </w:r>
-    </w:p>
-    <w:p>
-      <w:pPr>
-        <w:pStyle w:val="Body"/>
-        <w:numPr>
-          <w:ilvl w:val="0"/>
-          <w:numId w:val="39"/>
-        </w:numPr>
-        <w:rPr>
-          <w:lang w:val="en-GB"/>
-        </w:rPr>
-      </w:pPr>
-      <w:r>
-        <w:rPr>
-          <w:b/>
-          <w:bCs/>
-          <w:lang w:val="en-GB"/>
-        </w:rPr>
-        <w:t>Version Information</w:t>
-      </w:r>
-      <w:r>
-        <w:rPr>
-          <w:lang w:val="en-GB"/>
-        </w:rPr>
-        <w:t>: it is mandatory to fill all information to blanks correspondingly, whereas OEM Ticket# as optional. It also covers both AMD and INTEL design trace needs.</w:t>
-      </w:r>
-    </w:p>
-    <w:p>
-      <w:pPr>
-        <w:pStyle w:val="Body"/>
-        <w:numPr>
-          <w:ilvl w:val="0"/>
-          <w:numId w:val="39"/>
-        </w:numPr>
-        <w:rPr>
-          <w:lang w:val="en-GB"/>
-        </w:rPr>
-      </w:pPr>
-      <w:r>
-        <w:rPr>
-          <w:b/>
-          <w:bCs/>
-          <w:lang w:val="en-GB"/>
-        </w:rPr>
-        <w:t>Generic</w:t>
-      </w:r>
-      <w:r>
-        <w:rPr>
-          <w:lang w:val="en-GB"/>
-        </w:rPr>
-        <w:t xml:space="preserve">: </w:t>
-      </w:r>
-    </w:p>
-    <w:p>
-      <w:pPr>
-        <w:pStyle w:val="Body"/>
-        <w:numPr>
-          <w:ilvl w:val="1"/>
-          <w:numId w:val="39"/>
-        </w:numPr>
-        <w:rPr>
-          <w:lang w:val="en-GB"/>
-        </w:rPr>
-      </w:pPr>
-      <w:r>
-        <w:rPr>
-          <w:lang w:val="en-GB"/>
-        </w:rPr>
-        <w:t>USB-C</w:t>
-      </w:r>
-      <w:r>
-        <w:rPr>
-          <w:lang w:val="en-GB"/>
-        </w:rPr>
-        <w:t xml:space="preserve">: it </w:t>
-      </w:r>
-      <w:r>
-        <w:rPr>
-          <w:lang w:val="en-GB"/>
-        </w:rPr>
-        <w:t>defines SALEAE channel numbers to basic USB Type-C pins</w:t>
-      </w:r>
-      <w:r>
-        <w:rPr>
-          <w:lang w:val="en-GB"/>
-        </w:rPr>
-        <w:t>. All channels are recorded in both digital and analogue mode, and can be set to higher bitrate setting by enabling the “High Resolution” option.</w:t>
-      </w:r>
-      <w:r>
-        <w:rPr>
-          <w:lang w:val="en-GB"/>
-        </w:rPr>
-        <w:t xml:space="preserve"> </w:t>
-      </w:r>
-    </w:p>
-    <w:p>
-      <w:pPr>
-        <w:pStyle w:val="Body"/>
-        <w:numPr>
-          <w:ilvl w:val="1"/>
-          <w:numId w:val="39"/>
-        </w:numPr>
-        <w:rPr>
-          <w:lang w:val="en-GB"/>
-        </w:rPr>
-      </w:pPr>
-      <w:r>
-        <w:rPr>
-          <w:lang w:val="en-GB"/>
-        </w:rPr>
-        <w:lastRenderedPageBreak/>
-        <w:t xml:space="preserve">PD/PD to EC: it defines HPI bus to EC and PD UART. </w:t>
-      </w:r>
-    </w:p>
-    <w:p>
-      <w:pPr>
-        <w:pStyle w:val="Body"/>
-        <w:numPr>
-          <w:ilvl w:val="0"/>
-          <w:numId w:val="39"/>
-        </w:numPr>
-        <w:rPr>
-          <w:lang w:val="en-GB"/>
-        </w:rPr>
-      </w:pPr>
-      <w:r>
-        <w:rPr>
-          <w:b/>
-          <w:bCs/>
-          <w:lang w:val="en-GB"/>
-        </w:rPr>
-        <w:t>AMD/INTEL</w:t>
-      </w:r>
-      <w:r>
-        <w:rPr>
-          <w:b/>
-          <w:bCs/>
-          <w:lang w:val="en-GB"/>
-        </w:rPr>
-        <w:t xml:space="preserve"> </w:t>
-      </w:r>
-      <w:r>
-        <w:rPr>
-          <w:b/>
-          <w:bCs/>
-          <w:lang w:val="en-GB"/>
-        </w:rPr>
-        <w:t>Platform</w:t>
-      </w:r>
-      <w:r>
-        <w:rPr>
-          <w:lang w:val="en-GB"/>
-        </w:rPr>
-        <w:t xml:space="preserve">: it defines all necessary trace pins need for AMD and INTEL designs respectively. </w:t>
-      </w:r>
-      <w:r>
-        <w:rPr>
-          <w:lang w:val="en-GB"/>
-        </w:rPr>
-        <w:t>In AMD designs, MUX power pin SALEAE channel is shared with HPD pin. Please connect either one based on issue category.</w:t>
-      </w:r>
-    </w:p>
-    <w:p>
-      <w:pPr>
-        <w:pStyle w:val="Body"/>
-        <w:numPr>
-          <w:ilvl w:val="0"/>
-          <w:numId w:val="39"/>
-        </w:numPr>
-        <w:rPr>
-          <w:lang w:val="en-GB"/>
-        </w:rPr>
-      </w:pPr>
-      <w:r>
-        <w:rPr>
-          <w:b/>
-          <w:bCs/>
-          <w:lang w:val="en-GB"/>
-        </w:rPr>
-        <w:t>Start Recording</w:t>
-      </w:r>
-      <w:r>
-        <w:rPr>
-          <w:lang w:val="en-GB"/>
-        </w:rPr>
-        <w:t>: the main button to control Saleae Logic 2 application. It will be grey-out if lack of data in Version Information section, or channel selection duplication. Use this button to start / stop log capturing in Saleae Logic 2 application</w:t>
-      </w:r>
-      <w:r>
-        <w:rPr>
-          <w:lang w:val="en-GB"/>
-        </w:rPr>
-        <w:t xml:space="preserve"> without save</w:t>
-      </w:r>
-      <w:r>
-        <w:rPr>
-          <w:lang w:val="en-GB"/>
-        </w:rPr>
-        <w:t>.</w:t>
-      </w:r>
-    </w:p>
-    <w:p>
-      <w:pPr>
-        <w:pStyle w:val="AnchorLine"/>
-        <w:rPr>
-          <w:lang w:val="en-GB"/>
-        </w:rPr>
-      </w:pPr>
-    </w:p>
-    <w:p>
-      <w:pPr>
-        <w:pStyle w:val="Body"/>
-        <w:numPr>
-          <w:ilvl w:val="0"/>
-          <w:numId w:val="39"/>
-        </w:numPr>
-        <w:rPr>
-          <w:lang w:val="en-GB"/>
-        </w:rPr>
-      </w:pPr>
-      <w:r>
-        <w:rPr>
-          <w:b/>
-          <w:bCs/>
-          <w:lang w:val="en-GB"/>
-        </w:rPr>
-        <w:t>Pass / Fail Case</w:t>
-      </w:r>
-      <w:r>
-        <w:rPr>
-          <w:lang w:val="en-GB"/>
-        </w:rPr>
-        <w:t>: the main button</w:t>
-      </w:r>
-      <w:r>
-        <w:rPr>
-          <w:lang w:val="en-GB"/>
-        </w:rPr>
-        <w:t>s</w:t>
-      </w:r>
-      <w:r>
-        <w:rPr>
-          <w:lang w:val="en-GB"/>
-        </w:rPr>
-        <w:t xml:space="preserve"> to </w:t>
-      </w:r>
-      <w:r>
-        <w:rPr>
-          <w:lang w:val="en-GB"/>
-        </w:rPr>
-        <w:t xml:space="preserve">save recorded logs for pass and fail cases. By clicking either buttons, it will save the current logs as pass or fail cases and export to an issue tracker form with all data described in Version Information section. </w:t>
-      </w:r>
-      <w:r>
-        <w:rPr>
-          <w:lang w:val="en-GB"/>
-        </w:rPr>
-        <w:t xml:space="preserve">It will be grey-out </w:t>
-      </w:r>
-      <w:r>
-        <w:rPr>
-          <w:lang w:val="en-GB"/>
-        </w:rPr>
-        <w:t>before log capturing.</w:t>
-      </w:r>
-      <w:r>
-        <w:rPr>
-          <w:lang w:val="en-GB"/>
-        </w:rPr>
-        <w:t xml:space="preserve"> </w:t>
-      </w:r>
-    </w:p>
-    <w:p>
-      <w:pPr>
-        <w:pStyle w:val="AnchorLine"/>
-        <w:rPr>
-          <w:lang w:val="en-GB"/>
-        </w:rPr>
-      </w:pPr>
+        <w:t>This is a portable application that supports Microsoft Windows 10 and above. It is highly recommended to use it with Saleae Logic Analyser Pro 16. The application pre-defines all necessary trace pins that users are required to provide while reporting issues for both AMD and INTEL design cases, along with project-relevant information, such as PD firmware revision. All numbers in pulldown menus are selectable but cannot be duplicated.</w:t>
+      </w:r>
     </w:p>
     <w:tbl>
       <w:tblPr>
@@ -3457,10 +2938,1155 @@
                 <w:noProof/>
                 <w:lang w:val="en-GB"/>
               </w:rPr>
+              <w:lastRenderedPageBreak/>
+              <w:drawing>
+                <wp:inline distT="0" distB="0" distL="0" distR="0" wp14:anchorId="67460A74" wp14:editId="050BFCC7">
+                  <wp:extent cx="6480000" cy="2678400"/>
+                  <wp:effectExtent l="0" t="0" r="0" b="8255"/>
+                  <wp:docPr id="1" name="Picture 1" descr="WCS E2 training"/>
+                  <wp:cNvGraphicFramePr>
+                    <a:graphicFrameLocks xmlns:a="http://schemas.openxmlformats.org/drawingml/2006/main" noChangeAspect="1"/>
+                  </wp:cNvGraphicFramePr>
+                  <a:graphic xmlns:a="http://schemas.openxmlformats.org/drawingml/2006/main">
+                    <a:graphicData uri="http://schemas.openxmlformats.org/drawingml/2006/picture">
+                      <pic:pic xmlns:pic="http://schemas.openxmlformats.org/drawingml/2006/picture">
+                        <pic:nvPicPr>
+                          <pic:cNvPr id="7" name="Picture 7" descr="WCS E2 training"/>
+                          <pic:cNvPicPr>
+                            <a:picLocks noChangeAspect="1" noChangeArrowheads="1"/>
+                          </pic:cNvPicPr>
+                        </pic:nvPicPr>
+                        <pic:blipFill>
+                          <a:blip r:embed="rId19" cstate="print">
+                            <a:extLst>
+                              <a:ext uri="{28A0092B-C50C-407E-A947-70E740481C1C}">
+                                <a14:useLocalDpi xmlns:a14="http://schemas.microsoft.com/office/drawing/2010/main" val="0"/>
+                              </a:ext>
+                            </a:extLst>
+                          </a:blip>
+                          <a:srcRect/>
+                          <a:stretch>
+                            <a:fillRect/>
+                          </a:stretch>
+                        </pic:blipFill>
+                        <pic:spPr bwMode="auto">
+                          <a:xfrm>
+                            <a:off x="0" y="0"/>
+                            <a:ext cx="6480000" cy="2678400"/>
+                          </a:xfrm>
+                          <a:prstGeom prst="rect">
+                            <a:avLst/>
+                          </a:prstGeom>
+                          <a:noFill/>
+                        </pic:spPr>
+                      </pic:pic>
+                    </a:graphicData>
+                  </a:graphic>
+                </wp:inline>
+              </w:drawing>
+            </w:r>
+          </w:p>
+        </w:tc>
+      </w:tr>
+    </w:tbl>
+    <w:p>
+      <w:pPr>
+        <w:pStyle w:val="FigureTitle"/>
+        <w:numPr>
+          <w:ilvl w:val="0"/>
+          <w:numId w:val="7"/>
+        </w:numPr>
+        <w:tabs>
+          <w:tab w:val="num" w:pos="1418"/>
+        </w:tabs>
+        <w:ind w:left="1418" w:hanging="1418"/>
+        <w:jc w:val="center"/>
+        <w:rPr>
+          <w:lang w:val="en-GB"/>
+        </w:rPr>
+      </w:pPr>
+      <w:r>
+        <w:rPr>
+          <w:lang w:val="en-GB"/>
+        </w:rPr>
+        <w:t>WCS PD Host E2 training</w:t>
+      </w:r>
+    </w:p>
+    <w:p>
+      <w:pPr>
+        <w:pStyle w:val="Body"/>
+        <w:rPr>
+          <w:lang w:val="en-GB"/>
+        </w:rPr>
+      </w:pPr>
+      <w:r>
+        <w:rPr>
+          <w:lang w:val="en-GB"/>
+        </w:rPr>
+        <w:t>S</w:t>
+      </w:r>
+      <w:r>
+        <w:rPr>
+          <w:lang w:val="en-GB"/>
+        </w:rPr>
+        <w:t>ALEAE log file</w:t>
+      </w:r>
+      <w:r>
+        <w:rPr>
+          <w:lang w:val="en-GB"/>
+        </w:rPr>
+        <w:t>s</w:t>
+      </w:r>
+      <w:r>
+        <w:rPr>
+          <w:lang w:val="en-GB"/>
+        </w:rPr>
+        <w:t xml:space="preserve"> </w:t>
+      </w:r>
+      <w:r>
+        <w:rPr>
+          <w:lang w:val="en-GB"/>
+        </w:rPr>
+        <w:t>will be</w:t>
+      </w:r>
+      <w:r>
+        <w:rPr>
+          <w:lang w:val="en-GB"/>
+        </w:rPr>
+        <w:t xml:space="preserve"> </w:t>
+      </w:r>
+      <w:r>
+        <w:rPr>
+          <w:lang w:val="en-GB"/>
+        </w:rPr>
+        <w:t>generated based on channel number settings, associated with corresponding bus analysers respectively. The</w:t>
+      </w:r>
+      <w:r>
+        <w:rPr>
+          <w:lang w:val="en-GB"/>
+        </w:rPr>
+        <w:t>se</w:t>
+      </w:r>
+      <w:r>
+        <w:rPr>
+          <w:lang w:val="en-GB"/>
+        </w:rPr>
+        <w:t xml:space="preserve"> file</w:t>
+      </w:r>
+      <w:r>
+        <w:rPr>
+          <w:lang w:val="en-GB"/>
+        </w:rPr>
+        <w:t>s</w:t>
+      </w:r>
+      <w:r>
+        <w:rPr>
+          <w:lang w:val="en-GB"/>
+        </w:rPr>
+        <w:t xml:space="preserve"> </w:t>
+      </w:r>
+      <w:r>
+        <w:rPr>
+          <w:lang w:val="en-GB"/>
+        </w:rPr>
+        <w:t>are</w:t>
+      </w:r>
+      <w:r>
+        <w:rPr>
+          <w:lang w:val="en-GB"/>
+        </w:rPr>
+        <w:t xml:space="preserve"> named beginning with DATE_TIME as a </w:t>
+      </w:r>
+      <w:r>
+        <w:rPr>
+          <w:lang w:val="en-GB"/>
+        </w:rPr>
+        <w:t>prefix</w:t>
+      </w:r>
+      <w:r>
+        <w:rPr>
+          <w:lang w:val="en-GB"/>
+        </w:rPr>
+        <w:t xml:space="preserve"> and</w:t>
+      </w:r>
+      <w:r>
+        <w:rPr>
+          <w:lang w:val="en-GB"/>
+        </w:rPr>
+        <w:t xml:space="preserve"> appended with </w:t>
+      </w:r>
+      <w:r>
+        <w:rPr>
+          <w:lang w:val="en-GB"/>
+        </w:rPr>
+        <w:t>selected</w:t>
+      </w:r>
+      <w:r>
+        <w:rPr>
+          <w:lang w:val="en-GB"/>
+        </w:rPr>
+        <w:t xml:space="preserve"> data in the Version Information section. In addition, </w:t>
+      </w:r>
+      <w:r>
+        <w:rPr>
+          <w:lang w:val="en-GB"/>
+        </w:rPr>
+        <w:t xml:space="preserve">an issue tracker form and </w:t>
+      </w:r>
+      <w:r>
+        <w:rPr>
+          <w:lang w:val="en-GB"/>
+        </w:rPr>
+        <w:t xml:space="preserve">a text file named by the current date will be outputted under the same </w:t>
+      </w:r>
+      <w:r>
+        <w:rPr>
+          <w:lang w:val="en-GB"/>
+        </w:rPr>
+        <w:t xml:space="preserve">naming </w:t>
+      </w:r>
+      <w:r>
+        <w:rPr>
+          <w:lang w:val="en-GB"/>
+        </w:rPr>
+        <w:t>folder</w:t>
+      </w:r>
+      <w:r>
+        <w:rPr>
+          <w:lang w:val="en-GB"/>
+        </w:rPr>
+        <w:t xml:space="preserve">. </w:t>
+      </w:r>
+    </w:p>
+    <w:p>
+      <w:pPr>
+        <w:pStyle w:val="Body"/>
+        <w:rPr>
+          <w:lang w:val="en-GB"/>
+        </w:rPr>
+      </w:pPr>
+      <w:r>
+        <w:rPr>
+          <w:lang w:val="en-GB"/>
+        </w:rPr>
+        <w:t xml:space="preserve">The Main window splits in following sections (refer to Figure </w:t>
+      </w:r>
+      <w:r>
+        <w:rPr>
+          <w:lang w:val="en-GB"/>
+        </w:rPr>
+        <w:t>7</w:t>
+      </w:r>
+      <w:r>
+        <w:rPr>
+          <w:lang w:val="en-GB"/>
+        </w:rPr>
+        <w:t>):</w:t>
+      </w:r>
+    </w:p>
+    <w:p>
+      <w:pPr>
+        <w:pStyle w:val="Body"/>
+        <w:numPr>
+          <w:ilvl w:val="0"/>
+          <w:numId w:val="39"/>
+        </w:numPr>
+        <w:rPr>
+          <w:lang w:val="en-GB"/>
+        </w:rPr>
+      </w:pPr>
+      <w:r>
+        <w:rPr>
+          <w:b/>
+          <w:bCs/>
+          <w:lang w:val="en-GB"/>
+        </w:rPr>
+        <w:t>Version Information</w:t>
+      </w:r>
+      <w:r>
+        <w:rPr>
+          <w:lang w:val="en-GB"/>
+        </w:rPr>
+        <w:t>: it is mandatory to fill all information correspondingly, whereas OEM Ticket# as optional. It also covers both AMD and INTEL design trace needs.</w:t>
+      </w:r>
+      <w:r>
+        <w:rPr>
+          <w:lang w:val="en-GB"/>
+        </w:rPr>
+        <w:t xml:space="preserve"> All information will be recorded into issue tracker form automatically.</w:t>
+      </w:r>
+    </w:p>
+    <w:p>
+      <w:pPr>
+        <w:pStyle w:val="Body"/>
+        <w:numPr>
+          <w:ilvl w:val="0"/>
+          <w:numId w:val="39"/>
+        </w:numPr>
+        <w:rPr>
+          <w:lang w:val="en-GB"/>
+        </w:rPr>
+      </w:pPr>
+      <w:r>
+        <w:rPr>
+          <w:b/>
+          <w:bCs/>
+          <w:lang w:val="en-GB"/>
+        </w:rPr>
+        <w:t>Generic</w:t>
+      </w:r>
+      <w:r>
+        <w:rPr>
+          <w:lang w:val="en-GB"/>
+        </w:rPr>
+        <w:t xml:space="preserve">: </w:t>
+      </w:r>
+      <w:r>
+        <w:rPr>
+          <w:lang w:val="en-GB"/>
+        </w:rPr>
+        <w:t>this section describes common trace</w:t>
+      </w:r>
+      <w:r>
+        <w:rPr>
+          <w:lang w:val="en-GB"/>
+        </w:rPr>
+        <w:t xml:space="preserve"> pins</w:t>
+      </w:r>
+      <w:r>
+        <w:rPr>
+          <w:lang w:val="en-GB"/>
+        </w:rPr>
+        <w:t xml:space="preserve"> need in WCS PC host application:</w:t>
+      </w:r>
+    </w:p>
+    <w:p>
+      <w:pPr>
+        <w:pStyle w:val="Body"/>
+        <w:numPr>
+          <w:ilvl w:val="1"/>
+          <w:numId w:val="39"/>
+        </w:numPr>
+        <w:rPr>
+          <w:lang w:val="en-GB"/>
+        </w:rPr>
+      </w:pPr>
+      <w:r>
+        <w:rPr>
+          <w:lang w:val="en-GB"/>
+        </w:rPr>
+        <w:t>USB-C</w:t>
+      </w:r>
+      <w:r>
+        <w:rPr>
+          <w:lang w:val="en-GB"/>
+        </w:rPr>
+        <w:t xml:space="preserve">: it </w:t>
+      </w:r>
+      <w:r>
+        <w:rPr>
+          <w:lang w:val="en-GB"/>
+        </w:rPr>
+        <w:t>defines SALEAE channel numbers to basic USB Type-C pins</w:t>
+      </w:r>
+      <w:r>
+        <w:rPr>
+          <w:lang w:val="en-GB"/>
+        </w:rPr>
+        <w:t>. All channels are recorded in digital mode</w:t>
+      </w:r>
+      <w:r>
+        <w:rPr>
+          <w:lang w:val="en-GB"/>
+        </w:rPr>
+        <w:t xml:space="preserve"> as default</w:t>
+      </w:r>
+      <w:r>
+        <w:rPr>
+          <w:lang w:val="en-GB"/>
+        </w:rPr>
+        <w:t xml:space="preserve">, and can be set to </w:t>
+      </w:r>
+      <w:r>
+        <w:rPr>
+          <w:lang w:val="en-GB"/>
+        </w:rPr>
+        <w:t>digital + analogue mode</w:t>
+      </w:r>
+      <w:r>
+        <w:rPr>
+          <w:lang w:val="en-GB"/>
+        </w:rPr>
+        <w:t xml:space="preserve"> by enabling the “</w:t>
+      </w:r>
+      <w:r>
+        <w:rPr>
+          <w:lang w:val="en-GB"/>
+        </w:rPr>
+        <w:t>Analogue Mode</w:t>
+      </w:r>
+      <w:r>
+        <w:rPr>
+          <w:lang w:val="en-GB"/>
+        </w:rPr>
+        <w:t>” option</w:t>
+      </w:r>
+      <w:r>
+        <w:rPr>
+          <w:lang w:val="en-GB"/>
+        </w:rPr>
+        <w:t xml:space="preserve"> if necessary</w:t>
+      </w:r>
+      <w:r>
+        <w:rPr>
+          <w:lang w:val="en-GB"/>
+        </w:rPr>
+        <w:t>.</w:t>
+      </w:r>
+      <w:r>
+        <w:rPr>
+          <w:lang w:val="en-GB"/>
+        </w:rPr>
+        <w:t xml:space="preserve"> </w:t>
+      </w:r>
+    </w:p>
+    <w:p>
+      <w:pPr>
+        <w:pStyle w:val="Body"/>
+        <w:numPr>
+          <w:ilvl w:val="1"/>
+          <w:numId w:val="39"/>
+        </w:numPr>
+        <w:rPr>
+          <w:lang w:val="en-GB"/>
+        </w:rPr>
+      </w:pPr>
+      <w:r>
+        <w:rPr>
+          <w:lang w:val="en-GB"/>
+        </w:rPr>
+        <w:t xml:space="preserve">PD/PD to EC: it defines HPI bus to EC and PD UART. </w:t>
+      </w:r>
+    </w:p>
+    <w:p>
+      <w:pPr>
+        <w:pStyle w:val="Body"/>
+        <w:numPr>
+          <w:ilvl w:val="0"/>
+          <w:numId w:val="39"/>
+        </w:numPr>
+        <w:rPr>
+          <w:lang w:val="en-GB"/>
+        </w:rPr>
+      </w:pPr>
+      <w:r>
+        <w:rPr>
+          <w:b/>
+          <w:bCs/>
+          <w:lang w:val="en-GB"/>
+        </w:rPr>
+        <w:t>AMD/INTEL</w:t>
+      </w:r>
+      <w:r>
+        <w:rPr>
+          <w:b/>
+          <w:bCs/>
+          <w:lang w:val="en-GB"/>
+        </w:rPr>
+        <w:t xml:space="preserve"> </w:t>
+      </w:r>
+      <w:r>
+        <w:rPr>
+          <w:b/>
+          <w:bCs/>
+          <w:lang w:val="en-GB"/>
+        </w:rPr>
+        <w:t>Platform</w:t>
+      </w:r>
+      <w:r>
+        <w:rPr>
+          <w:lang w:val="en-GB"/>
+        </w:rPr>
+        <w:t xml:space="preserve">: it defines all necessary trace pins need for AMD and INTEL designs respectively. </w:t>
+      </w:r>
+      <w:r>
+        <w:rPr>
+          <w:lang w:val="en-GB"/>
+        </w:rPr>
+        <w:t>Please be notices that due to insufficient pin counts</w:t>
+      </w:r>
+      <w:r>
+        <w:rPr>
+          <w:lang w:val="en-GB"/>
+        </w:rPr>
+        <w:t xml:space="preserve"> available in SALEAE</w:t>
+      </w:r>
+      <w:r>
+        <w:rPr>
+          <w:lang w:val="en-GB"/>
+        </w:rPr>
+        <w:t>, i</w:t>
+      </w:r>
+      <w:r>
+        <w:rPr>
+          <w:lang w:val="en-GB"/>
+        </w:rPr>
+        <w:t xml:space="preserve">n AMD designs, MUX power pin SALEAE channel is shared with HPD pin. Please connect either one </w:t>
+      </w:r>
+      <w:r>
+        <w:rPr>
+          <w:lang w:val="en-GB"/>
+        </w:rPr>
+        <w:t>depends</w:t>
+      </w:r>
+      <w:r>
+        <w:rPr>
+          <w:lang w:val="en-GB"/>
+        </w:rPr>
+        <w:t xml:space="preserve"> on issue category</w:t>
+      </w:r>
+      <w:r>
+        <w:rPr>
+          <w:lang w:val="en-GB"/>
+        </w:rPr>
+        <w:t xml:space="preserve"> for AMD design cases</w:t>
+      </w:r>
+      <w:r>
+        <w:rPr>
+          <w:lang w:val="en-GB"/>
+        </w:rPr>
+        <w:t>.</w:t>
+      </w:r>
+    </w:p>
+    <w:p>
+      <w:pPr>
+        <w:pStyle w:val="Body"/>
+        <w:numPr>
+          <w:ilvl w:val="0"/>
+          <w:numId w:val="39"/>
+        </w:numPr>
+        <w:rPr>
+          <w:lang w:val="en-GB"/>
+        </w:rPr>
+      </w:pPr>
+      <w:r>
+        <w:rPr>
+          <w:b/>
+          <w:bCs/>
+          <w:lang w:val="en-GB"/>
+        </w:rPr>
+        <w:t>Start</w:t>
+      </w:r>
+      <w:r>
+        <w:rPr>
+          <w:b/>
+          <w:bCs/>
+          <w:lang w:val="en-GB"/>
+        </w:rPr>
+        <w:t>/Abort</w:t>
+      </w:r>
+      <w:r>
+        <w:rPr>
+          <w:b/>
+          <w:bCs/>
+          <w:lang w:val="en-GB"/>
+        </w:rPr>
+        <w:t xml:space="preserve"> Recording</w:t>
+      </w:r>
+      <w:r>
+        <w:rPr>
+          <w:lang w:val="en-GB"/>
+        </w:rPr>
+        <w:t xml:space="preserve">: the main button to control Saleae </w:t>
+      </w:r>
+      <w:r>
+        <w:rPr>
+          <w:lang w:val="en-GB"/>
+        </w:rPr>
+        <w:t>Logic2</w:t>
+      </w:r>
+      <w:r>
+        <w:rPr>
+          <w:lang w:val="en-GB"/>
+        </w:rPr>
+        <w:t xml:space="preserve"> application. It will be grey-out if </w:t>
+      </w:r>
+      <w:r>
+        <w:rPr>
+          <w:lang w:val="en-GB"/>
+        </w:rPr>
+        <w:t xml:space="preserve">data missing in </w:t>
+      </w:r>
+      <w:r>
+        <w:rPr>
+          <w:lang w:val="en-GB"/>
+        </w:rPr>
+        <w:t xml:space="preserve">Version Information section or channel selection duplication. Use this button to start / stop log capturing </w:t>
+      </w:r>
+      <w:r>
+        <w:rPr>
+          <w:lang w:val="en-GB"/>
+        </w:rPr>
+        <w:t>processes</w:t>
+      </w:r>
+      <w:r>
+        <w:rPr>
+          <w:lang w:val="en-GB"/>
+        </w:rPr>
+        <w:t>.</w:t>
+      </w:r>
+    </w:p>
+    <w:p>
+      <w:pPr>
+        <w:pStyle w:val="AnchorLine"/>
+        <w:rPr>
+          <w:lang w:val="en-GB"/>
+        </w:rPr>
+      </w:pPr>
+    </w:p>
+    <w:p>
+      <w:pPr>
+        <w:pStyle w:val="Body"/>
+        <w:numPr>
+          <w:ilvl w:val="0"/>
+          <w:numId w:val="39"/>
+        </w:numPr>
+        <w:rPr>
+          <w:lang w:val="en-GB"/>
+        </w:rPr>
+      </w:pPr>
+      <w:r>
+        <w:rPr>
+          <w:b/>
+          <w:bCs/>
+          <w:lang w:val="en-GB"/>
+        </w:rPr>
+        <w:t>Pass/Fail Case</w:t>
+      </w:r>
+      <w:r>
+        <w:rPr>
+          <w:lang w:val="en-GB"/>
+        </w:rPr>
+        <w:t>: the main button</w:t>
+      </w:r>
+      <w:r>
+        <w:rPr>
+          <w:lang w:val="en-GB"/>
+        </w:rPr>
+        <w:t>s</w:t>
+      </w:r>
+      <w:r>
+        <w:rPr>
+          <w:lang w:val="en-GB"/>
+        </w:rPr>
+        <w:t xml:space="preserve"> to </w:t>
+      </w:r>
+      <w:r>
+        <w:rPr>
+          <w:lang w:val="en-GB"/>
+        </w:rPr>
+        <w:t xml:space="preserve">save recorded logs for pass and fail cases. By clicking either buttons, it will save the current logs as pass or fail cases and export to an issue tracker form with all data described in Version Information section. </w:t>
+      </w:r>
+      <w:r>
+        <w:rPr>
+          <w:lang w:val="en-GB"/>
+        </w:rPr>
+        <w:t xml:space="preserve">It will be grey-out </w:t>
+      </w:r>
+      <w:r>
+        <w:rPr>
+          <w:lang w:val="en-GB"/>
+        </w:rPr>
+        <w:t>before log capturing.</w:t>
+      </w:r>
+      <w:r>
+        <w:rPr>
+          <w:lang w:val="en-GB"/>
+        </w:rPr>
+        <w:t xml:space="preserve"> </w:t>
+      </w:r>
+    </w:p>
+    <w:p>
+      <w:pPr>
+        <w:pStyle w:val="AnchorLine"/>
+        <w:rPr>
+          <w:lang w:val="en-GB"/>
+        </w:rPr>
+      </w:pPr>
+      <w:r>
+        <w:rPr>
+          <w:noProof/>
+          <w:lang w:val="en-GB"/>
+        </w:rPr>
+        <w:lastRenderedPageBreak/>
+        <mc:AlternateContent>
+          <mc:Choice Requires="wps">
+            <w:drawing>
+              <wp:anchor distT="0" distB="0" distL="114300" distR="114300" simplePos="0" relativeHeight="251666432" behindDoc="0" locked="0" layoutInCell="1" allowOverlap="1" wp14:anchorId="58F4F6AC" wp14:editId="5E752F31">
+                <wp:simplePos x="0" y="0"/>
+                <wp:positionH relativeFrom="column">
+                  <wp:posOffset>6211760</wp:posOffset>
+                </wp:positionH>
+                <wp:positionV relativeFrom="paragraph">
+                  <wp:posOffset>3875405</wp:posOffset>
+                </wp:positionV>
+                <wp:extent cx="405114" cy="393539"/>
+                <wp:effectExtent l="0" t="0" r="0" b="6985"/>
+                <wp:wrapNone/>
+                <wp:docPr id="39" name="Flowchart: Connector 39"/>
+                <wp:cNvGraphicFramePr/>
+                <a:graphic xmlns:a="http://schemas.openxmlformats.org/drawingml/2006/main">
+                  <a:graphicData uri="http://schemas.microsoft.com/office/word/2010/wordprocessingShape">
+                    <wps:wsp>
+                      <wps:cNvSpPr/>
+                      <wps:spPr>
+                        <a:xfrm>
+                          <a:off x="0" y="0"/>
+                          <a:ext cx="405114" cy="393539"/>
+                        </a:xfrm>
+                        <a:prstGeom prst="flowChartConnector">
+                          <a:avLst/>
+                        </a:prstGeom>
+                        <a:solidFill>
+                          <a:schemeClr val="tx2"/>
+                        </a:solidFill>
+                        <a:ln>
+                          <a:noFill/>
+                        </a:ln>
+                      </wps:spPr>
+                      <wps:style>
+                        <a:lnRef idx="2">
+                          <a:schemeClr val="accent1">
+                            <a:shade val="50000"/>
+                          </a:schemeClr>
+                        </a:lnRef>
+                        <a:fillRef idx="1">
+                          <a:schemeClr val="accent1"/>
+                        </a:fillRef>
+                        <a:effectRef idx="0">
+                          <a:schemeClr val="accent1"/>
+                        </a:effectRef>
+                        <a:fontRef idx="minor">
+                          <a:schemeClr val="lt1"/>
+                        </a:fontRef>
+                      </wps:style>
+                      <wps:txbx>
+                        <w:txbxContent>
+                          <w:p>
+                            <w:pPr>
+                              <w:jc w:val="center"/>
+                            </w:pPr>
+                            <w:r>
+                              <w:t>5</w:t>
+                            </w:r>
+                          </w:p>
+                        </w:txbxContent>
+                      </wps:txbx>
+                      <wps:bodyPr rot="0" spcFirstLastPara="0" vertOverflow="overflow" horzOverflow="overflow" vert="horz" wrap="square" lIns="91440" tIns="45720" rIns="91440" bIns="45720" numCol="1" spcCol="0" rtlCol="0" fromWordArt="0" anchor="ctr" anchorCtr="0" forceAA="0" compatLnSpc="1">
+                        <a:prstTxWarp prst="textNoShape">
+                          <a:avLst/>
+                        </a:prstTxWarp>
+                        <a:noAutofit/>
+                      </wps:bodyPr>
+                    </wps:wsp>
+                  </a:graphicData>
+                </a:graphic>
+                <wp14:sizeRelH relativeFrom="margin">
+                  <wp14:pctWidth>0</wp14:pctWidth>
+                </wp14:sizeRelH>
+                <wp14:sizeRelV relativeFrom="margin">
+                  <wp14:pctHeight>0</wp14:pctHeight>
+                </wp14:sizeRelV>
+              </wp:anchor>
+            </w:drawing>
+          </mc:Choice>
+          <mc:Fallback>
+            <w:pict>
+              <v:shape w14:anchorId="58F4F6AC" id="Flowchart: Connector 39" o:spid="_x0000_s1028" type="#_x0000_t120" style="position:absolute;margin-left:489.1pt;margin-top:305.15pt;width:31.9pt;height:31pt;z-index:251666432;visibility:visible;mso-wrap-style:square;mso-width-percent:0;mso-height-percent:0;mso-wrap-distance-left:9pt;mso-wrap-distance-top:0;mso-wrap-distance-right:9pt;mso-wrap-distance-bottom:0;mso-position-horizontal:absolute;mso-position-horizontal-relative:text;mso-position-vertical:absolute;mso-position-vertical-relative:text;mso-width-percent:0;mso-height-percent:0;mso-width-relative:margin;mso-height-relative:margin;v-text-anchor:middle" o:gfxdata="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" fillcolor="#84b6a7 [3215]" stroked="f" strokeweight="2pt">
+                <v:textbox>
+                  <w:txbxContent>
+                    <w:p>
+                      <w:pPr>
+                        <w:jc w:val="center"/>
+                      </w:pPr>
+                      <w:r>
+                        <w:t>5</w:t>
+                      </w:r>
+                    </w:p>
+                  </w:txbxContent>
+                </v:textbox>
+              </v:shape>
+            </w:pict>
+          </mc:Fallback>
+        </mc:AlternateContent>
+      </w:r>
+    </w:p>
+    <w:tbl>
+      <w:tblPr>
+        <w:tblStyle w:val="InfineonPicture"/>
+        <w:tblW w:w="5000" w:type="pct"/>
+        <w:tblBorders>
+          <w:top w:val="none" w:sz="0" w:space="0" w:color="auto"/>
+          <w:left w:val="none" w:sz="0" w:space="0" w:color="auto"/>
+          <w:bottom w:val="none" w:sz="0" w:space="0" w:color="auto"/>
+          <w:right w:val="none" w:sz="0" w:space="0" w:color="auto"/>
+          <w:insideH w:val="none" w:sz="0" w:space="0" w:color="auto"/>
+          <w:insideV w:val="none" w:sz="0" w:space="0" w:color="auto"/>
+        </w:tblBorders>
+        <w:tblCellMar>
+          <w:left w:w="0" w:type="dxa"/>
+          <w:right w:w="0" w:type="dxa"/>
+        </w:tblCellMar>
+        <w:tblLook w:val="05E0" w:firstRow="1" w:lastRow="1" w:firstColumn="1" w:lastColumn="1" w:noHBand="0" w:noVBand="1"/>
+      </w:tblPr>
+      <w:tblGrid>
+        <w:gridCol w:w="10206"/>
+      </w:tblGrid>
+      <w:tr>
+        <w:tc>
+          <w:tcPr>
+            <w:tcW w:w="5000" w:type="pct"/>
+          </w:tcPr>
+          <w:p>
+            <w:pPr>
+              <w:pStyle w:val="TableCell-c"/>
+              <w:rPr>
+                <w:lang w:val="en-GB"/>
+              </w:rPr>
+            </w:pPr>
+            <w:r>
+              <w:rPr>
+                <w:noProof/>
+                <w:lang w:val="en-GB"/>
+              </w:rPr>
               <mc:AlternateContent>
                 <mc:Choice Requires="wps">
                   <w:drawing>
-                    <wp:anchor distT="0" distB="0" distL="114300" distR="114300" simplePos="0" relativeHeight="251664384" behindDoc="0" locked="0" layoutInCell="1" allowOverlap="1" wp14:anchorId="0093FBEB" wp14:editId="321C96B9">
+                    <wp:anchor distT="0" distB="0" distL="114300" distR="114300" simplePos="0" relativeHeight="251663360" behindDoc="0" locked="0" layoutInCell="1" allowOverlap="1" wp14:anchorId="0E108B5C" wp14:editId="6ABBF1B8">
+                      <wp:simplePos x="0" y="0"/>
+                      <wp:positionH relativeFrom="column">
+                        <wp:posOffset>620272</wp:posOffset>
+                      </wp:positionH>
+                      <wp:positionV relativeFrom="paragraph">
+                        <wp:posOffset>3076698</wp:posOffset>
+                      </wp:positionV>
+                      <wp:extent cx="405114" cy="393539"/>
+                      <wp:effectExtent l="0" t="0" r="0" b="6985"/>
+                      <wp:wrapNone/>
+                      <wp:docPr id="38" name="Flowchart: Connector 38"/>
+                      <wp:cNvGraphicFramePr/>
+                      <a:graphic xmlns:a="http://schemas.openxmlformats.org/drawingml/2006/main">
+                        <a:graphicData uri="http://schemas.microsoft.com/office/word/2010/wordprocessingShape">
+                          <wps:wsp>
+                            <wps:cNvSpPr/>
+                            <wps:spPr>
+                              <a:xfrm>
+                                <a:off x="0" y="0"/>
+                                <a:ext cx="405114" cy="393539"/>
+                              </a:xfrm>
+                              <a:prstGeom prst="flowChartConnector">
+                                <a:avLst/>
+                              </a:prstGeom>
+                              <a:solidFill>
+                                <a:schemeClr val="tx2"/>
+                              </a:solidFill>
+                              <a:ln>
+                                <a:noFill/>
+                              </a:ln>
+                            </wps:spPr>
+                            <wps:style>
+                              <a:lnRef idx="2">
+                                <a:schemeClr val="accent1">
+                                  <a:shade val="50000"/>
+                                </a:schemeClr>
+                              </a:lnRef>
+                              <a:fillRef idx="1">
+                                <a:schemeClr val="accent1"/>
+                              </a:fillRef>
+                              <a:effectRef idx="0">
+                                <a:schemeClr val="accent1"/>
+                              </a:effectRef>
+                              <a:fontRef idx="minor">
+                                <a:schemeClr val="lt1"/>
+                              </a:fontRef>
+                            </wps:style>
+                            <wps:txbx>
+                              <w:txbxContent>
+                                <w:p>
+                                  <w:pPr>
+                                    <w:jc w:val="center"/>
+                                  </w:pPr>
+                                  <w:r>
+                                    <w:t>2</w:t>
+                                  </w:r>
+                                </w:p>
+                              </w:txbxContent>
+                            </wps:txbx>
+                            <wps:bodyPr rot="0" spcFirstLastPara="0" vertOverflow="overflow" horzOverflow="overflow" vert="horz" wrap="square" lIns="91440" tIns="45720" rIns="91440" bIns="45720" numCol="1" spcCol="0" rtlCol="0" fromWordArt="0" anchor="ctr" anchorCtr="0" forceAA="0" compatLnSpc="1">
+                              <a:prstTxWarp prst="textNoShape">
+                                <a:avLst/>
+                              </a:prstTxWarp>
+                              <a:noAutofit/>
+                            </wps:bodyPr>
+                          </wps:wsp>
+                        </a:graphicData>
+                      </a:graphic>
+                      <wp14:sizeRelH relativeFrom="margin">
+                        <wp14:pctWidth>0</wp14:pctWidth>
+                      </wp14:sizeRelH>
+                      <wp14:sizeRelV relativeFrom="margin">
+                        <wp14:pctHeight>0</wp14:pctHeight>
+                      </wp14:sizeRelV>
+                    </wp:anchor>
+                  </w:drawing>
+                </mc:Choice>
+                <mc:Fallback>
+                  <w:pict>
+                    <v:shape w14:anchorId="0E108B5C" id="Flowchart: Connector 38" o:spid="_x0000_s1029" type="#_x0000_t120" style="position:absolute;left:0;text-align:left;margin-left:48.85pt;margin-top:242.25pt;width:31.9pt;height:31pt;z-index:251663360;visibility:visible;mso-wrap-style:square;mso-width-percent:0;mso-height-percent:0;mso-wrap-distance-left:9pt;mso-wrap-distance-top:0;mso-wrap-distance-right:9pt;mso-wrap-distance-bottom:0;mso-position-horizontal:absolute;mso-position-horizontal-relative:text;mso-position-vertical:absolute;mso-position-vertical-relative:text;mso-width-percent:0;mso-height-percent:0;mso-width-relative:margin;mso-height-relative:margin;v-text-anchor:middle" o:gfxdata="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" fillcolor="#84b6a7 [3215]" stroked="f" strokeweight="2pt">
+                      <v:textbox>
+                        <w:txbxContent>
+                          <w:p>
+                            <w:pPr>
+                              <w:jc w:val="center"/>
+                            </w:pPr>
+                            <w:r>
+                              <w:t>2</w:t>
+                            </w:r>
+                          </w:p>
+                        </w:txbxContent>
+                      </v:textbox>
+                    </v:shape>
+                  </w:pict>
+                </mc:Fallback>
+              </mc:AlternateContent>
+            </w:r>
+            <w:r>
+              <w:rPr>
+                <w:noProof/>
+                <w:lang w:val="en-GB"/>
+              </w:rPr>
+              <mc:AlternateContent>
+                <mc:Choice Requires="wps">
+                  <w:drawing>
+                    <wp:anchor distT="0" distB="0" distL="114300" distR="114300" simplePos="0" relativeHeight="251662336" behindDoc="0" locked="0" layoutInCell="1" allowOverlap="1" wp14:anchorId="109CD959" wp14:editId="3878B9CB">
+                      <wp:simplePos x="0" y="0"/>
+                      <wp:positionH relativeFrom="column">
+                        <wp:posOffset>219928</wp:posOffset>
+                      </wp:positionH>
+                      <wp:positionV relativeFrom="paragraph">
+                        <wp:posOffset>430701</wp:posOffset>
+                      </wp:positionV>
+                      <wp:extent cx="405114" cy="393539"/>
+                      <wp:effectExtent l="0" t="0" r="0" b="6985"/>
+                      <wp:wrapNone/>
+                      <wp:docPr id="37" name="Flowchart: Connector 37"/>
+                      <wp:cNvGraphicFramePr/>
+                      <a:graphic xmlns:a="http://schemas.openxmlformats.org/drawingml/2006/main">
+                        <a:graphicData uri="http://schemas.microsoft.com/office/word/2010/wordprocessingShape">
+                          <wps:wsp>
+                            <wps:cNvSpPr/>
+                            <wps:spPr>
+                              <a:xfrm>
+                                <a:off x="0" y="0"/>
+                                <a:ext cx="405114" cy="393539"/>
+                              </a:xfrm>
+                              <a:prstGeom prst="flowChartConnector">
+                                <a:avLst/>
+                              </a:prstGeom>
+                              <a:solidFill>
+                                <a:schemeClr val="tx2"/>
+                              </a:solidFill>
+                              <a:ln>
+                                <a:noFill/>
+                              </a:ln>
+                            </wps:spPr>
+                            <wps:style>
+                              <a:lnRef idx="2">
+                                <a:schemeClr val="accent1">
+                                  <a:shade val="50000"/>
+                                </a:schemeClr>
+                              </a:lnRef>
+                              <a:fillRef idx="1">
+                                <a:schemeClr val="accent1"/>
+                              </a:fillRef>
+                              <a:effectRef idx="0">
+                                <a:schemeClr val="accent1"/>
+                              </a:effectRef>
+                              <a:fontRef idx="minor">
+                                <a:schemeClr val="lt1"/>
+                              </a:fontRef>
+                            </wps:style>
+                            <wps:txbx>
+                              <w:txbxContent>
+                                <w:p>
+                                  <w:pPr>
+                                    <w:jc w:val="center"/>
+                                  </w:pPr>
+                                  <w:r>
+                                    <w:t>1</w:t>
+                                  </w:r>
+                                </w:p>
+                              </w:txbxContent>
+                            </wps:txbx>
+                            <wps:bodyPr rot="0" spcFirstLastPara="0" vertOverflow="overflow" horzOverflow="overflow" vert="horz" wrap="square" lIns="91440" tIns="45720" rIns="91440" bIns="45720" numCol="1" spcCol="0" rtlCol="0" fromWordArt="0" anchor="ctr" anchorCtr="0" forceAA="0" compatLnSpc="1">
+                              <a:prstTxWarp prst="textNoShape">
+                                <a:avLst/>
+                              </a:prstTxWarp>
+                              <a:noAutofit/>
+                            </wps:bodyPr>
+                          </wps:wsp>
+                        </a:graphicData>
+                      </a:graphic>
+                      <wp14:sizeRelH relativeFrom="margin">
+                        <wp14:pctWidth>0</wp14:pctWidth>
+                      </wp14:sizeRelH>
+                      <wp14:sizeRelV relativeFrom="margin">
+                        <wp14:pctHeight>0</wp14:pctHeight>
+                      </wp14:sizeRelV>
+                    </wp:anchor>
+                  </w:drawing>
+                </mc:Choice>
+                <mc:Fallback>
+                  <w:pict>
+                    <v:shape w14:anchorId="109CD959" id="Flowchart: Connector 37" o:spid="_x0000_s1030" type="#_x0000_t120" style="position:absolute;left:0;text-align:left;margin-left:17.3pt;margin-top:33.9pt;width:31.9pt;height:31pt;z-index:251662336;visibility:visible;mso-wrap-style:square;mso-width-percent:0;mso-height-percent:0;mso-wrap-distance-left:9pt;mso-wrap-distance-top:0;mso-wrap-distance-right:9pt;mso-wrap-distance-bottom:0;mso-position-horizontal:absolute;mso-position-horizontal-relative:text;mso-position-vertical:absolute;mso-position-vertical-relative:text;mso-width-percent:0;mso-height-percent:0;mso-width-relative:margin;mso-height-relative:margin;v-text-anchor:middle" o:gfxdata="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" fillcolor="#84b6a7 [3215]" stroked="f" strokeweight="2pt">
+                      <v:textbox>
+                        <w:txbxContent>
+                          <w:p>
+                            <w:pPr>
+                              <w:jc w:val="center"/>
+                            </w:pPr>
+                            <w:r>
+                              <w:t>1</w:t>
+                            </w:r>
+                          </w:p>
+                        </w:txbxContent>
+                      </v:textbox>
+                    </v:shape>
+                  </w:pict>
+                </mc:Fallback>
+              </mc:AlternateContent>
+            </w:r>
+            <w:r>
+              <w:rPr>
+                <w:noProof/>
+                <w:lang w:val="en-GB"/>
+              </w:rPr>
+              <mc:AlternateContent>
+                <mc:Choice Requires="wps">
+                  <w:drawing>
+                    <wp:anchor distT="0" distB="0" distL="114300" distR="114300" simplePos="0" relativeHeight="251665408" behindDoc="0" locked="0" layoutInCell="1" allowOverlap="1" wp14:anchorId="4E8739E5" wp14:editId="43C1BDF5">
+                      <wp:simplePos x="0" y="0"/>
+                      <wp:positionH relativeFrom="column">
+                        <wp:posOffset>4909489</wp:posOffset>
+                      </wp:positionH>
+                      <wp:positionV relativeFrom="paragraph">
+                        <wp:posOffset>3251948</wp:posOffset>
+                      </wp:positionV>
+                      <wp:extent cx="405114" cy="393539"/>
+                      <wp:effectExtent l="0" t="0" r="0" b="6985"/>
+                      <wp:wrapNone/>
+                      <wp:docPr id="35" name="Flowchart: Connector 35">
+                        <a:extLst xmlns:a="http://schemas.openxmlformats.org/drawingml/2006/main">
+                          <a:ext uri="{C183D7F6-B498-43B3-948B-1728B52AA6E4}">
+                            <adec:decorative xmlns:adec="http://schemas.microsoft.com/office/drawing/2017/decorative" val="1"/>
+                          </a:ext>
+                        </a:extLst>
+                      </wp:docPr>
+                      <wp:cNvGraphicFramePr/>
+                      <a:graphic xmlns:a="http://schemas.openxmlformats.org/drawingml/2006/main">
+                        <a:graphicData uri="http://schemas.microsoft.com/office/word/2010/wordprocessingShape">
+                          <wps:wsp>
+                            <wps:cNvSpPr/>
+                            <wps:spPr>
+                              <a:xfrm>
+                                <a:off x="0" y="0"/>
+                                <a:ext cx="405114" cy="393539"/>
+                              </a:xfrm>
+                              <a:prstGeom prst="flowChartConnector">
+                                <a:avLst/>
+                              </a:prstGeom>
+                              <a:solidFill>
+                                <a:schemeClr val="tx2"/>
+                              </a:solidFill>
+                              <a:ln>
+                                <a:noFill/>
+                              </a:ln>
+                            </wps:spPr>
+                            <wps:style>
+                              <a:lnRef idx="2">
+                                <a:schemeClr val="accent1">
+                                  <a:shade val="50000"/>
+                                </a:schemeClr>
+                              </a:lnRef>
+                              <a:fillRef idx="1">
+                                <a:schemeClr val="accent1"/>
+                              </a:fillRef>
+                              <a:effectRef idx="0">
+                                <a:schemeClr val="accent1"/>
+                              </a:effectRef>
+                              <a:fontRef idx="minor">
+                                <a:schemeClr val="lt1"/>
+                              </a:fontRef>
+                            </wps:style>
+                            <wps:txbx>
+                              <w:txbxContent>
+                                <w:p>
+                                  <w:pPr>
+                                    <w:jc w:val="center"/>
+                                  </w:pPr>
+                                  <w:r>
+                                    <w:t>4</w:t>
+                                  </w:r>
+                                </w:p>
+                              </w:txbxContent>
+                            </wps:txbx>
+                            <wps:bodyPr rot="0" spcFirstLastPara="0" vertOverflow="overflow" horzOverflow="overflow" vert="horz" wrap="square" lIns="91440" tIns="45720" rIns="91440" bIns="45720" numCol="1" spcCol="0" rtlCol="0" fromWordArt="0" anchor="ctr" anchorCtr="0" forceAA="0" compatLnSpc="1">
+                              <a:prstTxWarp prst="textNoShape">
+                                <a:avLst/>
+                              </a:prstTxWarp>
+                              <a:noAutofit/>
+                            </wps:bodyPr>
+                          </wps:wsp>
+                        </a:graphicData>
+                      </a:graphic>
+                      <wp14:sizeRelH relativeFrom="margin">
+                        <wp14:pctWidth>0</wp14:pctWidth>
+                      </wp14:sizeRelH>
+                      <wp14:sizeRelV relativeFrom="margin">
+                        <wp14:pctHeight>0</wp14:pctHeight>
+                      </wp14:sizeRelV>
+                    </wp:anchor>
+                  </w:drawing>
+                </mc:Choice>
+                <mc:Fallback>
+                  <w:pict>
+                    <v:shape w14:anchorId="4E8739E5" id="Flowchart: Connector 35" o:spid="_x0000_s1031" type="#_x0000_t120" alt="&quot;&quot;" style="position:absolute;left:0;text-align:left;margin-left:386.55pt;margin-top:256.05pt;width:31.9pt;height:31pt;z-index:251665408;visibility:visible;mso-wrap-style:square;mso-width-percent:0;mso-height-percent:0;mso-wrap-distance-left:9pt;mso-wrap-distance-top:0;mso-wrap-distance-right:9pt;mso-wrap-distance-bottom:0;mso-position-horizontal:absolute;mso-position-horizontal-relative:text;mso-position-vertical:absolute;mso-position-vertical-relative:text;mso-width-percent:0;mso-height-percent:0;mso-width-relative:margin;mso-height-relative:margin;v-text-anchor:middle" o:gfxdata="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" fillcolor="#84b6a7 [3215]" stroked="f" strokeweight="2pt">
+                      <v:textbox>
+                        <w:txbxContent>
+                          <w:p>
+                            <w:pPr>
+                              <w:jc w:val="center"/>
+                            </w:pPr>
+                            <w:r>
+                              <w:t>4</w:t>
+                            </w:r>
+                          </w:p>
+                        </w:txbxContent>
+                      </v:textbox>
+                    </v:shape>
+                  </w:pict>
+                </mc:Fallback>
+              </mc:AlternateContent>
+            </w:r>
+            <w:r>
+              <w:rPr>
+                <w:noProof/>
+                <w:lang w:val="en-GB"/>
+              </w:rPr>
+              <mc:AlternateContent>
+                <mc:Choice Requires="wps">
+                  <w:drawing>
+                    <wp:anchor distT="0" distB="0" distL="114300" distR="114300" simplePos="0" relativeHeight="251664384" behindDoc="0" locked="0" layoutInCell="1" allowOverlap="1" wp14:anchorId="0093FBEB" wp14:editId="41C93CB7">
                       <wp:simplePos x="0" y="0"/>
                       <wp:positionH relativeFrom="column">
                         <wp:posOffset>3297555</wp:posOffset>
@@ -3540,7 +4166,7 @@
                 </mc:Choice>
                 <mc:Fallback>
                   <w:pict>
-                    <v:shape w14:anchorId="0093FBEB" id="Flowchart: Connector 36" o:spid="_x0000_s1028" type="#_x0000_t120" style="position:absolute;left:0;text-align:left;margin-left:259.65pt;margin-top:239.15pt;width:31.9pt;height:31pt;z-index:251664384;visibility:visible;mso-wrap-style:square;mso-width-percent:0;mso-height-percent:0;mso-wrap-distance-left:9pt;mso-wrap-distance-top:0;mso-wrap-distance-right:9pt;mso-wrap-distance-bottom:0;mso-position-horizontal:absolute;mso-position-horizontal-relative:text;mso-position-vertical:absolute;mso-position-vertical-relative:text;mso-width-percent:0;mso-height-percent:0;mso-width-relative:margin;mso-height-relative:margin;v-text-anchor:middle" o:gfxdata="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" fillcolor="#84b6a7 [3215]" stroked="f" strokeweight="2pt">
+                    <v:shape w14:anchorId="0093FBEB" id="Flowchart: Connector 36" o:spid="_x0000_s1032" type="#_x0000_t120" style="position:absolute;left:0;text-align:left;margin-left:259.65pt;margin-top:239.15pt;width:31.9pt;height:31pt;z-index:251664384;visibility:visible;mso-wrap-style:square;mso-width-percent:0;mso-height-percent:0;mso-wrap-distance-left:9pt;mso-wrap-distance-top:0;mso-wrap-distance-right:9pt;mso-wrap-distance-bottom:0;mso-position-horizontal:absolute;mso-position-horizontal-relative:text;mso-position-vertical:absolute;mso-position-vertical-relative:text;mso-width-percent:0;mso-height-percent:0;mso-width-relative:margin;mso-height-relative:margin;v-text-anchor:middle" o:gfxdata="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" fillcolor="#84b6a7 [3215]" stroked="f" strokeweight="2pt">
                       <v:textbox>
                         <w:txbxContent>
                           <w:p>
@@ -3563,440 +4189,10 @@
                 <w:noProof/>
                 <w:lang w:val="en-GB"/>
               </w:rPr>
-              <mc:AlternateContent>
-                <mc:Choice Requires="wps">
-                  <w:drawing>
-                    <wp:anchor distT="0" distB="0" distL="114300" distR="114300" simplePos="0" relativeHeight="251666432" behindDoc="0" locked="0" layoutInCell="1" allowOverlap="1" wp14:anchorId="58F4F6AC" wp14:editId="765A388B">
-                      <wp:simplePos x="0" y="0"/>
-                      <wp:positionH relativeFrom="column">
-                        <wp:posOffset>6076022</wp:posOffset>
-                      </wp:positionH>
-                      <wp:positionV relativeFrom="paragraph">
-                        <wp:posOffset>4041149</wp:posOffset>
-                      </wp:positionV>
-                      <wp:extent cx="405114" cy="393539"/>
-                      <wp:effectExtent l="0" t="0" r="0" b="6985"/>
-                      <wp:wrapNone/>
-                      <wp:docPr id="39" name="Flowchart: Connector 39"/>
-                      <wp:cNvGraphicFramePr/>
-                      <a:graphic xmlns:a="http://schemas.openxmlformats.org/drawingml/2006/main">
-                        <a:graphicData uri="http://schemas.microsoft.com/office/word/2010/wordprocessingShape">
-                          <wps:wsp>
-                            <wps:cNvSpPr/>
-                            <wps:spPr>
-                              <a:xfrm>
-                                <a:off x="0" y="0"/>
-                                <a:ext cx="405114" cy="393539"/>
-                              </a:xfrm>
-                              <a:prstGeom prst="flowChartConnector">
-                                <a:avLst/>
-                              </a:prstGeom>
-                              <a:solidFill>
-                                <a:schemeClr val="tx2"/>
-                              </a:solidFill>
-                              <a:ln>
-                                <a:noFill/>
-                              </a:ln>
-                            </wps:spPr>
-                            <wps:style>
-                              <a:lnRef idx="2">
-                                <a:schemeClr val="accent1">
-                                  <a:shade val="50000"/>
-                                </a:schemeClr>
-                              </a:lnRef>
-                              <a:fillRef idx="1">
-                                <a:schemeClr val="accent1"/>
-                              </a:fillRef>
-                              <a:effectRef idx="0">
-                                <a:schemeClr val="accent1"/>
-                              </a:effectRef>
-                              <a:fontRef idx="minor">
-                                <a:schemeClr val="lt1"/>
-                              </a:fontRef>
-                            </wps:style>
-                            <wps:txbx>
-                              <w:txbxContent>
-                                <w:p>
-                                  <w:pPr>
-                                    <w:jc w:val="center"/>
-                                  </w:pPr>
-                                  <w:r>
-                                    <w:t>5</w:t>
-                                  </w:r>
-                                </w:p>
-                              </w:txbxContent>
-                            </wps:txbx>
-                            <wps:bodyPr rot="0" spcFirstLastPara="0" vertOverflow="overflow" horzOverflow="overflow" vert="horz" wrap="square" lIns="91440" tIns="45720" rIns="91440" bIns="45720" numCol="1" spcCol="0" rtlCol="0" fromWordArt="0" anchor="ctr" anchorCtr="0" forceAA="0" compatLnSpc="1">
-                              <a:prstTxWarp prst="textNoShape">
-                                <a:avLst/>
-                              </a:prstTxWarp>
-                              <a:noAutofit/>
-                            </wps:bodyPr>
-                          </wps:wsp>
-                        </a:graphicData>
-                      </a:graphic>
-                      <wp14:sizeRelH relativeFrom="margin">
-                        <wp14:pctWidth>0</wp14:pctWidth>
-                      </wp14:sizeRelH>
-                      <wp14:sizeRelV relativeFrom="margin">
-                        <wp14:pctHeight>0</wp14:pctHeight>
-                      </wp14:sizeRelV>
-                    </wp:anchor>
-                  </w:drawing>
-                </mc:Choice>
-                <mc:Fallback>
-                  <w:pict>
-                    <v:shape w14:anchorId="58F4F6AC" id="Flowchart: Connector 39" o:spid="_x0000_s1029" type="#_x0000_t120" style="position:absolute;left:0;text-align:left;margin-left:478.45pt;margin-top:318.2pt;width:31.9pt;height:31pt;z-index:251666432;visibility:visible;mso-wrap-style:square;mso-width-percent:0;mso-height-percent:0;mso-wrap-distance-left:9pt;mso-wrap-distance-top:0;mso-wrap-distance-right:9pt;mso-wrap-distance-bottom:0;mso-position-horizontal:absolute;mso-position-horizontal-relative:text;mso-position-vertical:absolute;mso-position-vertical-relative:text;mso-width-percent:0;mso-height-percent:0;mso-width-relative:margin;mso-height-relative:margin;v-text-anchor:middle" o:gfxdata="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" fillcolor="#84b6a7 [3215]" stroked="f" strokeweight="2pt">
-                      <v:textbox>
-                        <w:txbxContent>
-                          <w:p>
-                            <w:pPr>
-                              <w:jc w:val="center"/>
-                            </w:pPr>
-                            <w:r>
-                              <w:t>5</w:t>
-                            </w:r>
-                          </w:p>
-                        </w:txbxContent>
-                      </v:textbox>
-                    </v:shape>
-                  </w:pict>
-                </mc:Fallback>
-              </mc:AlternateContent>
-            </w:r>
-            <w:r>
-              <w:rPr>
-                <w:noProof/>
-                <w:lang w:val="en-GB"/>
-              </w:rPr>
-              <mc:AlternateContent>
-                <mc:Choice Requires="wps">
-                  <w:drawing>
-                    <wp:anchor distT="0" distB="0" distL="114300" distR="114300" simplePos="0" relativeHeight="251665408" behindDoc="0" locked="0" layoutInCell="1" allowOverlap="1" wp14:anchorId="4E8739E5" wp14:editId="5346A0CB">
-                      <wp:simplePos x="0" y="0"/>
-                      <wp:positionH relativeFrom="column">
-                        <wp:posOffset>6077140</wp:posOffset>
-                      </wp:positionH>
-                      <wp:positionV relativeFrom="paragraph">
-                        <wp:posOffset>3122712</wp:posOffset>
-                      </wp:positionV>
-                      <wp:extent cx="405114" cy="393539"/>
-                      <wp:effectExtent l="0" t="0" r="0" b="6985"/>
-                      <wp:wrapNone/>
-                      <wp:docPr id="35" name="Flowchart: Connector 35">
-                        <a:extLst xmlns:a="http://schemas.openxmlformats.org/drawingml/2006/main">
-                          <a:ext uri="{C183D7F6-B498-43B3-948B-1728B52AA6E4}">
-                            <adec:decorative xmlns:adec="http://schemas.microsoft.com/office/drawing/2017/decorative" val="1"/>
-                          </a:ext>
-                        </a:extLst>
-                      </wp:docPr>
-                      <wp:cNvGraphicFramePr/>
-                      <a:graphic xmlns:a="http://schemas.openxmlformats.org/drawingml/2006/main">
-                        <a:graphicData uri="http://schemas.microsoft.com/office/word/2010/wordprocessingShape">
-                          <wps:wsp>
-                            <wps:cNvSpPr/>
-                            <wps:spPr>
-                              <a:xfrm>
-                                <a:off x="0" y="0"/>
-                                <a:ext cx="405114" cy="393539"/>
-                              </a:xfrm>
-                              <a:prstGeom prst="flowChartConnector">
-                                <a:avLst/>
-                              </a:prstGeom>
-                              <a:solidFill>
-                                <a:schemeClr val="tx2"/>
-                              </a:solidFill>
-                              <a:ln>
-                                <a:noFill/>
-                              </a:ln>
-                            </wps:spPr>
-                            <wps:style>
-                              <a:lnRef idx="2">
-                                <a:schemeClr val="accent1">
-                                  <a:shade val="50000"/>
-                                </a:schemeClr>
-                              </a:lnRef>
-                              <a:fillRef idx="1">
-                                <a:schemeClr val="accent1"/>
-                              </a:fillRef>
-                              <a:effectRef idx="0">
-                                <a:schemeClr val="accent1"/>
-                              </a:effectRef>
-                              <a:fontRef idx="minor">
-                                <a:schemeClr val="lt1"/>
-                              </a:fontRef>
-                            </wps:style>
-                            <wps:txbx>
-                              <w:txbxContent>
-                                <w:p>
-                                  <w:pPr>
-                                    <w:jc w:val="center"/>
-                                  </w:pPr>
-                                  <w:r>
-                                    <w:t>4</w:t>
-                                  </w:r>
-                                </w:p>
-                              </w:txbxContent>
-                            </wps:txbx>
-                            <wps:bodyPr rot="0" spcFirstLastPara="0" vertOverflow="overflow" horzOverflow="overflow" vert="horz" wrap="square" lIns="91440" tIns="45720" rIns="91440" bIns="45720" numCol="1" spcCol="0" rtlCol="0" fromWordArt="0" anchor="ctr" anchorCtr="0" forceAA="0" compatLnSpc="1">
-                              <a:prstTxWarp prst="textNoShape">
-                                <a:avLst/>
-                              </a:prstTxWarp>
-                              <a:noAutofit/>
-                            </wps:bodyPr>
-                          </wps:wsp>
-                        </a:graphicData>
-                      </a:graphic>
-                      <wp14:sizeRelH relativeFrom="margin">
-                        <wp14:pctWidth>0</wp14:pctWidth>
-                      </wp14:sizeRelH>
-                      <wp14:sizeRelV relativeFrom="margin">
-                        <wp14:pctHeight>0</wp14:pctHeight>
-                      </wp14:sizeRelV>
-                    </wp:anchor>
-                  </w:drawing>
-                </mc:Choice>
-                <mc:Fallback>
-                  <w:pict>
-                    <v:shape w14:anchorId="4E8739E5" id="Flowchart: Connector 35" o:spid="_x0000_s1030" type="#_x0000_t120" alt="&quot;&quot;" style="position:absolute;left:0;text-align:left;margin-left:478.5pt;margin-top:245.9pt;width:31.9pt;height:31pt;z-index:251665408;visibility:visible;mso-wrap-style:square;mso-width-percent:0;mso-height-percent:0;mso-wrap-distance-left:9pt;mso-wrap-distance-top:0;mso-wrap-distance-right:9pt;mso-wrap-distance-bottom:0;mso-position-horizontal:absolute;mso-position-horizontal-relative:text;mso-position-vertical:absolute;mso-position-vertical-relative:text;mso-width-percent:0;mso-height-percent:0;mso-width-relative:margin;mso-height-relative:margin;v-text-anchor:middle" o:gfxdata="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" fillcolor="#84b6a7 [3215]" stroked="f" strokeweight="2pt">
-                      <v:textbox>
-                        <w:txbxContent>
-                          <w:p>
-                            <w:pPr>
-                              <w:jc w:val="center"/>
-                            </w:pPr>
-                            <w:r>
-                              <w:t>4</w:t>
-                            </w:r>
-                          </w:p>
-                        </w:txbxContent>
-                      </v:textbox>
-                    </v:shape>
-                  </w:pict>
-                </mc:Fallback>
-              </mc:AlternateContent>
-            </w:r>
-            <w:r>
-              <w:rPr>
-                <w:noProof/>
-                <w:lang w:val="en-GB"/>
-              </w:rPr>
-              <mc:AlternateContent>
-                <mc:Choice Requires="wps">
-                  <w:drawing>
-                    <wp:anchor distT="0" distB="0" distL="114300" distR="114300" simplePos="0" relativeHeight="251663360" behindDoc="0" locked="0" layoutInCell="1" allowOverlap="1" wp14:anchorId="0E108B5C" wp14:editId="04D2DEE3">
-                      <wp:simplePos x="0" y="0"/>
-                      <wp:positionH relativeFrom="column">
-                        <wp:posOffset>-139312</wp:posOffset>
-                      </wp:positionH>
-                      <wp:positionV relativeFrom="paragraph">
-                        <wp:posOffset>3431691</wp:posOffset>
-                      </wp:positionV>
-                      <wp:extent cx="405114" cy="393539"/>
-                      <wp:effectExtent l="0" t="0" r="0" b="6985"/>
-                      <wp:wrapNone/>
-                      <wp:docPr id="38" name="Flowchart: Connector 38"/>
-                      <wp:cNvGraphicFramePr/>
-                      <a:graphic xmlns:a="http://schemas.openxmlformats.org/drawingml/2006/main">
-                        <a:graphicData uri="http://schemas.microsoft.com/office/word/2010/wordprocessingShape">
-                          <wps:wsp>
-                            <wps:cNvSpPr/>
-                            <wps:spPr>
-                              <a:xfrm>
-                                <a:off x="0" y="0"/>
-                                <a:ext cx="405114" cy="393539"/>
-                              </a:xfrm>
-                              <a:prstGeom prst="flowChartConnector">
-                                <a:avLst/>
-                              </a:prstGeom>
-                              <a:solidFill>
-                                <a:schemeClr val="tx2"/>
-                              </a:solidFill>
-                              <a:ln>
-                                <a:noFill/>
-                              </a:ln>
-                            </wps:spPr>
-                            <wps:style>
-                              <a:lnRef idx="2">
-                                <a:schemeClr val="accent1">
-                                  <a:shade val="50000"/>
-                                </a:schemeClr>
-                              </a:lnRef>
-                              <a:fillRef idx="1">
-                                <a:schemeClr val="accent1"/>
-                              </a:fillRef>
-                              <a:effectRef idx="0">
-                                <a:schemeClr val="accent1"/>
-                              </a:effectRef>
-                              <a:fontRef idx="minor">
-                                <a:schemeClr val="lt1"/>
-                              </a:fontRef>
-                            </wps:style>
-                            <wps:txbx>
-                              <w:txbxContent>
-                                <w:p>
-                                  <w:pPr>
-                                    <w:jc w:val="center"/>
-                                  </w:pPr>
-                                  <w:r>
-                                    <w:t>2</w:t>
-                                  </w:r>
-                                </w:p>
-                              </w:txbxContent>
-                            </wps:txbx>
-                            <wps:bodyPr rot="0" spcFirstLastPara="0" vertOverflow="overflow" horzOverflow="overflow" vert="horz" wrap="square" lIns="91440" tIns="45720" rIns="91440" bIns="45720" numCol="1" spcCol="0" rtlCol="0" fromWordArt="0" anchor="ctr" anchorCtr="0" forceAA="0" compatLnSpc="1">
-                              <a:prstTxWarp prst="textNoShape">
-                                <a:avLst/>
-                              </a:prstTxWarp>
-                              <a:noAutofit/>
-                            </wps:bodyPr>
-                          </wps:wsp>
-                        </a:graphicData>
-                      </a:graphic>
-                      <wp14:sizeRelH relativeFrom="margin">
-                        <wp14:pctWidth>0</wp14:pctWidth>
-                      </wp14:sizeRelH>
-                      <wp14:sizeRelV relativeFrom="margin">
-                        <wp14:pctHeight>0</wp14:pctHeight>
-                      </wp14:sizeRelV>
-                    </wp:anchor>
-                  </w:drawing>
-                </mc:Choice>
-                <mc:Fallback>
-                  <w:pict>
-                    <v:shape w14:anchorId="0E108B5C" id="Flowchart: Connector 38" o:spid="_x0000_s1031" type="#_x0000_t120" style="position:absolute;left:0;text-align:left;margin-left:-10.95pt;margin-top:270.2pt;width:31.9pt;height:31pt;z-index:251663360;visibility:visible;mso-wrap-style:square;mso-width-percent:0;mso-height-percent:0;mso-wrap-distance-left:9pt;mso-wrap-distance-top:0;mso-wrap-distance-right:9pt;mso-wrap-distance-bottom:0;mso-position-horizontal:absolute;mso-position-horizontal-relative:text;mso-position-vertical:absolute;mso-position-vertical-relative:text;mso-width-percent:0;mso-height-percent:0;mso-width-relative:margin;mso-height-relative:margin;v-text-anchor:middle" o:gfxdata="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" fillcolor="#84b6a7 [3215]" stroked="f" strokeweight="2pt">
-                      <v:textbox>
-                        <w:txbxContent>
-                          <w:p>
-                            <w:pPr>
-                              <w:jc w:val="center"/>
-                            </w:pPr>
-                            <w:r>
-                              <w:t>2</w:t>
-                            </w:r>
-                          </w:p>
-                        </w:txbxContent>
-                      </v:textbox>
-                    </v:shape>
-                  </w:pict>
-                </mc:Fallback>
-              </mc:AlternateContent>
-            </w:r>
-            <w:r>
-              <w:rPr>
-                <w:noProof/>
-                <w:lang w:val="en-GB"/>
-              </w:rPr>
-              <mc:AlternateContent>
-                <mc:Choice Requires="wps">
-                  <w:drawing>
-                    <wp:anchor distT="0" distB="0" distL="114300" distR="114300" simplePos="0" relativeHeight="251662336" behindDoc="0" locked="0" layoutInCell="1" allowOverlap="1" wp14:anchorId="109CD959" wp14:editId="72519AF9">
-                      <wp:simplePos x="0" y="0"/>
-                      <wp:positionH relativeFrom="column">
-                        <wp:posOffset>78019</wp:posOffset>
-                      </wp:positionH>
-                      <wp:positionV relativeFrom="paragraph">
-                        <wp:posOffset>479311</wp:posOffset>
-                      </wp:positionV>
-                      <wp:extent cx="405114" cy="393539"/>
-                      <wp:effectExtent l="0" t="0" r="0" b="6985"/>
-                      <wp:wrapNone/>
-                      <wp:docPr id="37" name="Flowchart: Connector 37"/>
-                      <wp:cNvGraphicFramePr/>
-                      <a:graphic xmlns:a="http://schemas.openxmlformats.org/drawingml/2006/main">
-                        <a:graphicData uri="http://schemas.microsoft.com/office/word/2010/wordprocessingShape">
-                          <wps:wsp>
-                            <wps:cNvSpPr/>
-                            <wps:spPr>
-                              <a:xfrm>
-                                <a:off x="0" y="0"/>
-                                <a:ext cx="405114" cy="393539"/>
-                              </a:xfrm>
-                              <a:prstGeom prst="flowChartConnector">
-                                <a:avLst/>
-                              </a:prstGeom>
-                              <a:solidFill>
-                                <a:schemeClr val="tx2"/>
-                              </a:solidFill>
-                              <a:ln>
-                                <a:noFill/>
-                              </a:ln>
-                            </wps:spPr>
-                            <wps:style>
-                              <a:lnRef idx="2">
-                                <a:schemeClr val="accent1">
-                                  <a:shade val="50000"/>
-                                </a:schemeClr>
-                              </a:lnRef>
-                              <a:fillRef idx="1">
-                                <a:schemeClr val="accent1"/>
-                              </a:fillRef>
-                              <a:effectRef idx="0">
-                                <a:schemeClr val="accent1"/>
-                              </a:effectRef>
-                              <a:fontRef idx="minor">
-                                <a:schemeClr val="lt1"/>
-                              </a:fontRef>
-                            </wps:style>
-                            <wps:txbx>
-                              <w:txbxContent>
-                                <w:p>
-                                  <w:pPr>
-                                    <w:jc w:val="center"/>
-                                  </w:pPr>
-                                  <w:r>
-                                    <w:t>1</w:t>
-                                  </w:r>
-                                </w:p>
-                              </w:txbxContent>
-                            </wps:txbx>
-                            <wps:bodyPr rot="0" spcFirstLastPara="0" vertOverflow="overflow" horzOverflow="overflow" vert="horz" wrap="square" lIns="91440" tIns="45720" rIns="91440" bIns="45720" numCol="1" spcCol="0" rtlCol="0" fromWordArt="0" anchor="ctr" anchorCtr="0" forceAA="0" compatLnSpc="1">
-                              <a:prstTxWarp prst="textNoShape">
-                                <a:avLst/>
-                              </a:prstTxWarp>
-                              <a:noAutofit/>
-                            </wps:bodyPr>
-                          </wps:wsp>
-                        </a:graphicData>
-                      </a:graphic>
-                      <wp14:sizeRelH relativeFrom="margin">
-                        <wp14:pctWidth>0</wp14:pctWidth>
-                      </wp14:sizeRelH>
-                      <wp14:sizeRelV relativeFrom="margin">
-                        <wp14:pctHeight>0</wp14:pctHeight>
-                      </wp14:sizeRelV>
-                    </wp:anchor>
-                  </w:drawing>
-                </mc:Choice>
-                <mc:Fallback>
-                  <w:pict>
-                    <v:shape w14:anchorId="109CD959" id="Flowchart: Connector 37" o:spid="_x0000_s1032" type="#_x0000_t120" style="position:absolute;left:0;text-align:left;margin-left:6.15pt;margin-top:37.75pt;width:31.9pt;height:31pt;z-index:251662336;visibility:visible;mso-wrap-style:square;mso-width-percent:0;mso-height-percent:0;mso-wrap-distance-left:9pt;mso-wrap-distance-top:0;mso-wrap-distance-right:9pt;mso-wrap-distance-bottom:0;mso-position-horizontal:absolute;mso-position-horizontal-relative:text;mso-position-vertical:absolute;mso-position-vertical-relative:text;mso-width-percent:0;mso-height-percent:0;mso-width-relative:margin;mso-height-relative:margin;v-text-anchor:middle" o:gfxdata="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" fillcolor="#84b6a7 [3215]" stroked="f" strokeweight="2pt">
-                      <v:textbox>
-                        <w:txbxContent>
-                          <w:p>
-                            <w:pPr>
-                              <w:jc w:val="center"/>
-                            </w:pPr>
-                            <w:r>
-                              <w:t>1</w:t>
-                            </w:r>
-                          </w:p>
-                        </w:txbxContent>
-                      </v:textbox>
-                    </v:shape>
-                  </w:pict>
-                </mc:Fallback>
-              </mc:AlternateContent>
-            </w:r>
-            <w:r>
-              <w:rPr>
-                <w:noProof/>
-                <w:lang w:val="en-GB"/>
-              </w:rPr>
               <w:drawing>
-                <wp:inline distT="0" distB="0" distL="0" distR="0" wp14:anchorId="73D99986" wp14:editId="526B3E67">
-                  <wp:extent cx="6480000" cy="5062500"/>
-                  <wp:effectExtent l="0" t="0" r="0" b="5080"/>
+                <wp:inline distT="0" distB="0" distL="0" distR="0" wp14:anchorId="73D99986" wp14:editId="2471D49B">
+                  <wp:extent cx="6479998" cy="5052630"/>
+                  <wp:effectExtent l="0" t="0" r="0" b="0"/>
                   <wp:docPr id="42" name="Picture 42"/>
                   <wp:cNvGraphicFramePr>
                     <a:graphicFrameLocks xmlns:a="http://schemas.openxmlformats.org/drawingml/2006/main" noChangeAspect="1"/>
@@ -4009,7 +4205,7 @@
                           <pic:cNvPicPr/>
                         </pic:nvPicPr>
                         <pic:blipFill>
-                          <a:blip r:embed="rId22">
+                          <a:blip r:embed="rId20">
                             <a:extLst>
                               <a:ext uri="{28A0092B-C50C-407E-A947-70E740481C1C}">
                                 <a14:useLocalDpi xmlns:a14="http://schemas.microsoft.com/office/drawing/2010/main" val="0"/>
@@ -4023,7 +4219,7 @@
                         <pic:spPr>
                           <a:xfrm>
                             <a:off x="0" y="0"/>
-                            <a:ext cx="6480000" cy="5062500"/>
+                            <a:ext cx="6479998" cy="5052630"/>
                           </a:xfrm>
                           <a:prstGeom prst="rect">
                             <a:avLst/>
@@ -4059,7 +4255,7 @@
         <w:rPr>
           <w:lang w:val="en-GB"/>
         </w:rPr>
-        <w:t>Infineon PD Logger</w:t>
+        <w:t>Infineon WCS Logger</w:t>
       </w:r>
     </w:p>
     <w:p>
@@ -4093,7 +4289,7 @@
         </w:rPr>
       </w:pPr>
       <w:bookmarkStart w:id="22" w:name="_Toc137461262"/>
-      <w:bookmarkStart w:id="23" w:name="_Toc140759464"/>
+      <w:bookmarkStart w:id="23" w:name="_Toc141081667"/>
       <w:r>
         <w:rPr>
           <w:lang w:val="en-GB"/>
@@ -4115,13 +4311,49 @@
         <w:rPr>
           <w:lang w:val="en-GB"/>
         </w:rPr>
-        <w:t>Here is functional flow chart and t</w:t>
-      </w:r>
-      <w:r>
-        <w:rPr>
-          <w:lang w:val="en-GB"/>
-        </w:rPr>
-        <w:t>here are 2 possible approaches in Infineon PD Logger usage</w:t>
+        <w:t xml:space="preserve">Here is functional flow chart </w:t>
+      </w:r>
+      <w:r>
+        <w:rPr>
+          <w:lang w:val="en-GB"/>
+        </w:rPr>
+        <w:t xml:space="preserve">to illustrate Infineon WCS logger working model. Depends on Saleae Logic2 application running condition, </w:t>
+      </w:r>
+      <w:r>
+        <w:rPr>
+          <w:lang w:val="en-GB"/>
+        </w:rPr>
+        <w:t>t</w:t>
+      </w:r>
+      <w:r>
+        <w:rPr>
+          <w:lang w:val="en-GB"/>
+        </w:rPr>
+        <w:t xml:space="preserve">here are 2 possible </w:t>
+      </w:r>
+      <w:r>
+        <w:rPr>
+          <w:lang w:val="en-GB"/>
+        </w:rPr>
+        <w:t>scenarios</w:t>
+      </w:r>
+      <w:r>
+        <w:rPr>
+          <w:lang w:val="en-GB"/>
+        </w:rPr>
+        <w:t xml:space="preserve"> in </w:t>
+      </w:r>
+      <w:r>
+        <w:rPr>
+          <w:lang w:val="en-GB"/>
+        </w:rPr>
+        <w:t>Infineon WCS Logger</w:t>
+      </w:r>
+      <w:r>
+        <w:rPr>
+          <w:lang w:val="en-GB"/>
+        </w:rPr>
+        <w:t xml:space="preserve"> usage</w:t>
       </w:r>
       <w:r>
         <w:rPr>
@@ -4184,7 +4416,7 @@
                           <pic:cNvPicPr/>
                         </pic:nvPicPr>
                         <pic:blipFill>
-                          <a:blip r:embed="rId23"/>
+                          <a:blip r:embed="rId21"/>
                           <a:stretch>
                             <a:fillRect/>
                           </a:stretch>
@@ -4228,7 +4460,7 @@
         <w:rPr>
           <w:lang w:val="en-GB"/>
         </w:rPr>
-        <w:t>Infineon PD Logger</w:t>
+        <w:t>Infineon WCS Logger</w:t>
       </w:r>
       <w:r>
         <w:rPr>
@@ -4245,7 +4477,7 @@
         </w:rPr>
       </w:pPr>
       <w:bookmarkStart w:id="24" w:name="_Toc137461263"/>
-      <w:bookmarkStart w:id="25" w:name="_Toc140759465"/>
+      <w:bookmarkStart w:id="25" w:name="_Toc141081668"/>
       <w:r>
         <w:rPr>
           <w:lang w:val="en-GB"/>
@@ -4272,7 +4504,31 @@
         <w:rPr>
           <w:lang w:val="en-GB"/>
         </w:rPr>
-        <w:t>This user scenario presumes Saleae Logic 2 application is not running in the background while starting Infineon PD Logger application. The benefit is users do not need to enable Saleae Automation option beforehand.</w:t>
+        <w:t xml:space="preserve">This user scenario presumes Saleae </w:t>
+      </w:r>
+      <w:r>
+        <w:rPr>
+          <w:lang w:val="en-GB"/>
+        </w:rPr>
+        <w:t>Logic2</w:t>
+      </w:r>
+      <w:r>
+        <w:rPr>
+          <w:lang w:val="en-GB"/>
+        </w:rPr>
+        <w:t xml:space="preserve"> application is not running in the background while starting </w:t>
+      </w:r>
+      <w:r>
+        <w:rPr>
+          <w:lang w:val="en-GB"/>
+        </w:rPr>
+        <w:t>Infineon WCS Logger</w:t>
+      </w:r>
+      <w:r>
+        <w:rPr>
+          <w:lang w:val="en-GB"/>
+        </w:rPr>
+        <w:t xml:space="preserve"> application. The benefit is users do not need to enable Saleae Automation option beforehand.</w:t>
       </w:r>
     </w:p>
     <w:p>
@@ -4290,7 +4546,19 @@
         <w:rPr>
           <w:lang w:val="en-GB"/>
         </w:rPr>
-        <w:t>Start Infineon PD Logger.</w:t>
+        <w:t xml:space="preserve">Start </w:t>
+      </w:r>
+      <w:r>
+        <w:rPr>
+          <w:lang w:val="en-GB"/>
+        </w:rPr>
+        <w:t>Infineon WCS Logger</w:t>
+      </w:r>
+      <w:r>
+        <w:rPr>
+          <w:lang w:val="en-GB"/>
+        </w:rPr>
+        <w:t>.</w:t>
       </w:r>
     </w:p>
     <w:p>
@@ -4356,7 +4624,25 @@
         <w:rPr>
           <w:lang w:val="en-GB"/>
         </w:rPr>
-        <w:t>Infineon PD Logger launches Saleae Logic 2 application with automation supportive.</w:t>
+        <w:t>Infineon WCS Logger</w:t>
+      </w:r>
+      <w:r>
+        <w:rPr>
+          <w:lang w:val="en-GB"/>
+        </w:rPr>
+        <w:t xml:space="preserve"> launches Saleae </w:t>
+      </w:r>
+      <w:r>
+        <w:rPr>
+          <w:lang w:val="en-GB"/>
+        </w:rPr>
+        <w:t>Logic2</w:t>
+      </w:r>
+      <w:r>
+        <w:rPr>
+          <w:lang w:val="en-GB"/>
+        </w:rPr>
+        <w:t xml:space="preserve"> application with automation supportive.</w:t>
       </w:r>
     </w:p>
     <w:p>
@@ -4434,7 +4720,13 @@
         <w:rPr>
           <w:lang w:val="en-GB"/>
         </w:rPr>
-        <w:t>Infineon PD Logger assigns bus analysers to generated SALEAE log, and record capture settings in the text configuration file</w:t>
+        <w:t>Infineon WCS Logger</w:t>
+      </w:r>
+      <w:r>
+        <w:rPr>
+          <w:lang w:val="en-GB"/>
+        </w:rPr>
+        <w:t xml:space="preserve"> assigns bus analysers to generated SALEAE log, and record capture settings in the text configuration file</w:t>
       </w:r>
       <w:r>
         <w:rPr>
@@ -4464,6 +4756,7 @@
         <w:rPr>
           <w:lang w:val="en-GB"/>
         </w:rPr>
+        <w:lastRenderedPageBreak/>
         <w:t>Repeat step 3 to 7 for another log capture round.</w:t>
       </w:r>
     </w:p>
@@ -4482,8 +4775,31 @@
         <w:rPr>
           <w:lang w:val="en-GB"/>
         </w:rPr>
-        <w:lastRenderedPageBreak/>
-        <w:t>Close Infineon PD Logger while finished, and Saleae Logic 2 application will be shut down.</w:t>
+        <w:t xml:space="preserve">Close </w:t>
+      </w:r>
+      <w:r>
+        <w:rPr>
+          <w:lang w:val="en-GB"/>
+        </w:rPr>
+        <w:t>Infineon WCS Logger</w:t>
+      </w:r>
+      <w:r>
+        <w:rPr>
+          <w:lang w:val="en-GB"/>
+        </w:rPr>
+        <w:t xml:space="preserve"> while finished, and Saleae </w:t>
+      </w:r>
+      <w:r>
+        <w:rPr>
+          <w:lang w:val="en-GB"/>
+        </w:rPr>
+        <w:t>Logic2</w:t>
+      </w:r>
+      <w:r>
+        <w:rPr>
+          <w:lang w:val="en-GB"/>
+        </w:rPr>
+        <w:t xml:space="preserve"> application will be shut down.</w:t>
       </w:r>
     </w:p>
     <w:p>
@@ -4502,7 +4818,7 @@
         </w:rPr>
       </w:pPr>
       <w:bookmarkStart w:id="26" w:name="_Toc137461264"/>
-      <w:bookmarkStart w:id="27" w:name="_Toc140759466"/>
+      <w:bookmarkStart w:id="27" w:name="_Toc141081669"/>
       <w:r>
         <w:rPr>
           <w:lang w:val="en-GB"/>
@@ -4523,7 +4839,31 @@
         <w:rPr>
           <w:lang w:val="en-GB"/>
         </w:rPr>
-        <w:t>This user scenario only works while automation option is enabled in Saleae Logic 2 application as pre-requisites. In this case, it is presumed users launch Saleae Logic 2 application already.</w:t>
+        <w:t xml:space="preserve">This user scenario only works while automation option is enabled in Saleae </w:t>
+      </w:r>
+      <w:r>
+        <w:rPr>
+          <w:lang w:val="en-GB"/>
+        </w:rPr>
+        <w:t>Logic2</w:t>
+      </w:r>
+      <w:r>
+        <w:rPr>
+          <w:lang w:val="en-GB"/>
+        </w:rPr>
+        <w:t xml:space="preserve"> application as pre-requisites. In this case, it is presumed users launch Saleae </w:t>
+      </w:r>
+      <w:r>
+        <w:rPr>
+          <w:lang w:val="en-GB"/>
+        </w:rPr>
+        <w:t>Logic2</w:t>
+      </w:r>
+      <w:r>
+        <w:rPr>
+          <w:lang w:val="en-GB"/>
+        </w:rPr>
+        <w:t xml:space="preserve"> application already.</w:t>
       </w:r>
     </w:p>
     <w:p>
@@ -4541,7 +4881,19 @@
         <w:rPr>
           <w:lang w:val="en-GB"/>
         </w:rPr>
-        <w:t>Start Infineon PD Logger.</w:t>
+        <w:t xml:space="preserve">Start </w:t>
+      </w:r>
+      <w:r>
+        <w:rPr>
+          <w:lang w:val="en-GB"/>
+        </w:rPr>
+        <w:t>Infineon WCS Logger</w:t>
+      </w:r>
+      <w:r>
+        <w:rPr>
+          <w:lang w:val="en-GB"/>
+        </w:rPr>
+        <w:t>.</w:t>
       </w:r>
     </w:p>
     <w:p>
@@ -4679,7 +5031,13 @@
         <w:rPr>
           <w:lang w:val="en-GB"/>
         </w:rPr>
-        <w:t>Infineon PD Logger assigns bus analysers to generated SALEAE log, and record capture settings in the text configuration file</w:t>
+        <w:t>Infineon WCS Logger</w:t>
+      </w:r>
+      <w:r>
+        <w:rPr>
+          <w:lang w:val="en-GB"/>
+        </w:rPr>
+        <w:t xml:space="preserve"> assigns bus analysers to generated SALEAE log, and record capture settings in the text configuration file</w:t>
       </w:r>
       <w:r>
         <w:rPr>
@@ -4727,7 +5085,31 @@
         <w:rPr>
           <w:lang w:val="en-GB"/>
         </w:rPr>
-        <w:t xml:space="preserve">Close Infineon PD Logger while finished, and Saleae Logic 2 application will </w:t>
+        <w:t xml:space="preserve">Close </w:t>
+      </w:r>
+      <w:r>
+        <w:rPr>
+          <w:lang w:val="en-GB"/>
+        </w:rPr>
+        <w:t>Infineon WCS Logger</w:t>
+      </w:r>
+      <w:r>
+        <w:rPr>
+          <w:lang w:val="en-GB"/>
+        </w:rPr>
+        <w:t xml:space="preserve"> while finished, and Saleae </w:t>
+      </w:r>
+      <w:r>
+        <w:rPr>
+          <w:lang w:val="en-GB"/>
+        </w:rPr>
+        <w:t>Logic2</w:t>
+      </w:r>
+      <w:r>
+        <w:rPr>
+          <w:lang w:val="en-GB"/>
+        </w:rPr>
+        <w:t xml:space="preserve"> application will </w:t>
       </w:r>
       <w:r>
         <w:rPr>
@@ -4777,7 +5159,7 @@
         </w:rPr>
       </w:pPr>
       <w:bookmarkStart w:id="28" w:name="_Toc137461265"/>
-      <w:bookmarkStart w:id="29" w:name="_Toc140759467"/>
+      <w:bookmarkStart w:id="29" w:name="_Toc141081670"/>
       <w:r>
         <w:rPr>
           <w:lang w:val="en-GB"/>
@@ -4790,7 +5172,13 @@
         <w:rPr>
           <w:lang w:val="en-GB"/>
         </w:rPr>
-        <w:t xml:space="preserve"> of Infineon PD Logger</w:t>
+        <w:t xml:space="preserve"> of </w:t>
+      </w:r>
+      <w:r>
+        <w:rPr>
+          <w:lang w:val="en-GB"/>
+        </w:rPr>
+        <w:t>Infineon WCS Logger</w:t>
       </w:r>
       <w:bookmarkEnd w:id="29"/>
     </w:p>
@@ -4811,7 +5199,19 @@
         <w:rPr>
           <w:lang w:val="en-GB"/>
         </w:rPr>
-        <w:t xml:space="preserve"> of Infineon PD Logger, including</w:t>
+        <w:t xml:space="preserve"> of </w:t>
+      </w:r>
+      <w:r>
+        <w:rPr>
+          <w:lang w:val="en-GB"/>
+        </w:rPr>
+        <w:t>Infineon WCS Logger</w:t>
+      </w:r>
+      <w:r>
+        <w:rPr>
+          <w:lang w:val="en-GB"/>
+        </w:rPr>
+        <w:t>, including</w:t>
       </w:r>
       <w:r>
         <w:rPr>
@@ -4871,7 +5271,19 @@
         <w:rPr>
           <w:lang w:val="en-GB"/>
         </w:rPr>
-        <w:t xml:space="preserve"> might crash if Saleae Logic 2 application does not enable automation option while working at Scenario B.</w:t>
+        <w:t xml:space="preserve"> might crash if Saleae </w:t>
+      </w:r>
+      <w:r>
+        <w:rPr>
+          <w:lang w:val="en-GB"/>
+        </w:rPr>
+        <w:t>Logic2</w:t>
+      </w:r>
+      <w:r>
+        <w:rPr>
+          <w:lang w:val="en-GB"/>
+        </w:rPr>
+        <w:t xml:space="preserve"> application does not enable automation option while working at Scenario B.</w:t>
       </w:r>
     </w:p>
     <w:p>
@@ -4901,7 +5313,31 @@
         <w:rPr>
           <w:lang w:val="en-GB"/>
         </w:rPr>
-        <w:t xml:space="preserve"> Saleae Logic 2 application directly might cause Infineon PD Logger crash.</w:t>
+        <w:t xml:space="preserve"> Saleae </w:t>
+      </w:r>
+      <w:r>
+        <w:rPr>
+          <w:lang w:val="en-GB"/>
+        </w:rPr>
+        <w:t>Logic2</w:t>
+      </w:r>
+      <w:r>
+        <w:rPr>
+          <w:lang w:val="en-GB"/>
+        </w:rPr>
+        <w:t xml:space="preserve"> application directly might cause </w:t>
+      </w:r>
+      <w:r>
+        <w:rPr>
+          <w:lang w:val="en-GB"/>
+        </w:rPr>
+        <w:t>Infineon WCS Logger</w:t>
+      </w:r>
+      <w:r>
+        <w:rPr>
+          <w:lang w:val="en-GB"/>
+        </w:rPr>
+        <w:t xml:space="preserve"> crash.</w:t>
       </w:r>
     </w:p>
     <w:p>
@@ -4962,7 +5398,7 @@
           <w:color w:val="auto"/>
         </w:rPr>
         <w:sectPr>
-          <w:headerReference w:type="default" r:id="rId24"/>
+          <w:headerReference w:type="default" r:id="rId22"/>
           <w:footnotePr>
             <w:numRestart w:val="eachPage"/>
           </w:footnotePr>
@@ -5001,7 +5437,7 @@
         </w:rPr>
       </w:pPr>
       <w:bookmarkStart w:id="34" w:name="_Toc137461266"/>
-      <w:bookmarkStart w:id="35" w:name="_Toc140759468"/>
+      <w:bookmarkStart w:id="35" w:name="_Toc141081671"/>
       <w:r>
         <w:rPr>
           <w:lang w:val="en-GB"/>
@@ -5858,7 +6294,7 @@
       <w:pPr>
         <w:pStyle w:val="HeadingPreface"/>
       </w:pPr>
-      <w:bookmarkStart w:id="36" w:name="_Toc140759469"/>
+      <w:bookmarkStart w:id="36" w:name="_Toc141081672"/>
       <w:r>
         <w:lastRenderedPageBreak/>
         <w:t>Revision h</w:t>
@@ -6081,7 +6517,7 @@
         </w:tabs>
         <w:ind w:left="1418" w:hanging="1418"/>
         <w:sectPr>
-          <w:headerReference w:type="default" r:id="rId25"/>
+          <w:headerReference w:type="default" r:id="rId23"/>
           <w:footnotePr>
             <w:numRestart w:val="eachPage"/>
           </w:footnotePr>
@@ -6098,7 +6534,7 @@
       <w:pPr>
         <w:pStyle w:val="Body"/>
         <w:sectPr>
-          <w:headerReference w:type="default" r:id="rId26"/>
+          <w:headerReference w:type="default" r:id="rId24"/>
           <w:footnotePr>
             <w:numRestart w:val="eachPage"/>
           </w:footnotePr>
@@ -6118,9 +6554,9 @@
           <w:noProof/>
         </w:rPr>
         <w:sectPr>
-          <w:headerReference w:type="even" r:id="rId27"/>
-          <w:headerReference w:type="default" r:id="rId28"/>
-          <w:footerReference w:type="default" r:id="rId29"/>
+          <w:headerReference w:type="even" r:id="rId25"/>
+          <w:headerReference w:type="default" r:id="rId26"/>
+          <w:footerReference w:type="default" r:id="rId27"/>
           <w:footnotePr>
             <w:numRestart w:val="eachPage"/>
           </w:footnotePr>
@@ -6275,7 +6711,7 @@
     </w:r>
     <w:fldSimple w:instr=" DOCPROPERTY  Doc_State  \* MERGEFORMAT ">
       <w:r>
-        <w:t>v 1.0</w:t>
+        <w:t>v1.0</w:t>
       </w:r>
     </w:fldSimple>
     <w:r>
@@ -6395,7 +6831,7 @@
     </w:r>
     <w:fldSimple w:instr=" DOCPROPERTY  Doc_State  \* MERGEFORMAT ">
       <w:r>
-        <w:t>v 1.0</w:t>
+        <w:t>v1.0</w:t>
       </w:r>
     </w:fldSimple>
     <w:r>
@@ -7289,7 +7725,7 @@
         <v:shape id="_x0000_s1027" type="#_x0000_t75" style="position:absolute;margin-left:-45.75pt;margin-top:36.55pt;width:602.45pt;height:313.15pt;z-index:-251638272">
           <v:imagedata r:id="rId1" o:title=""/>
         </v:shape>
-        <o:OLEObject Type="Embed" ProgID="Visio.Drawing.15" ShapeID="_x0000_s1027" DrawAspect="Content" ObjectID="_1751372382" r:id="rId2"/>
+        <o:OLEObject Type="Embed" ProgID="Visio.Drawing.15" ShapeID="_x0000_s1027" DrawAspect="Content" ObjectID="_1751694444" r:id="rId2"/>
       </w:object>
     </w:r>
     <w:r>
@@ -8491,7 +8927,7 @@
               <wp:lineTo x="6310" y="0"/>
             </wp:wrapPolygon>
           </wp:wrapThrough>
-          <wp:docPr id="1" name="Picture 1"/>
+          <wp:docPr id="63" name="Picture 63"/>
           <wp:cNvGraphicFramePr>
             <a:graphicFrameLocks xmlns:a="http://schemas.openxmlformats.org/drawingml/2006/main" noChangeAspect="1"/>
           </wp:cNvGraphicFramePr>
@@ -9005,7 +9441,7 @@
                                   <w:sz w:val="24"/>
                                   <w:szCs w:val="24"/>
                                 </w:rPr>
-                                <w:t>automation tool to assist end-user in WCS PC host application</w:t>
+                                <w:t>The assistant in WCS PC host applications</w:t>
                               </w:r>
                             </w:p>
                           </w:sdtContent>
@@ -9115,7 +9551,7 @@
                             <w:sz w:val="24"/>
                             <w:szCs w:val="24"/>
                           </w:rPr>
-                          <w:t>automation tool to assist end-user in WCS PC host application</w:t>
+                          <w:t>The assistant in WCS PC host applications</w:t>
                         </w:r>
                       </w:p>
                     </w:sdtContent>
@@ -9146,7 +9582,7 @@
           <wp:extent cx="1676400" cy="723265"/>
           <wp:effectExtent l="0" t="0" r="0" b="635"/>
           <wp:wrapNone/>
-          <wp:docPr id="12" name="Picture 12" descr="ComneonLogo" hidden="1"/>
+          <wp:docPr id="67" name="Picture 67" descr="ComneonLogo" hidden="1"/>
           <wp:cNvGraphicFramePr>
             <a:graphicFrameLocks xmlns:a="http://schemas.openxmlformats.org/drawingml/2006/main" noChangeAspect="1"/>
           </wp:cNvGraphicFramePr>
@@ -9321,7 +9757,7 @@
               <wp:lineTo x="0" y="0"/>
             </wp:wrapPolygon>
           </wp:wrapThrough>
-          <wp:docPr id="13" name="Picture 13"/>
+          <wp:docPr id="69" name="Picture 69"/>
           <wp:cNvGraphicFramePr>
             <a:graphicFrameLocks xmlns:a="http://schemas.openxmlformats.org/drawingml/2006/main" noChangeAspect="1"/>
           </wp:cNvGraphicFramePr>
@@ -9663,7 +10099,7 @@
               <wp:lineTo x="6310" y="0"/>
             </wp:wrapPolygon>
           </wp:wrapThrough>
-          <wp:docPr id="18" name="Picture 18"/>
+          <wp:docPr id="70" name="Picture 70"/>
           <wp:cNvGraphicFramePr>
             <a:graphicFrameLocks xmlns:a="http://schemas.openxmlformats.org/drawingml/2006/main" noChangeAspect="1"/>
           </wp:cNvGraphicFramePr>
@@ -9724,7 +10160,7 @@
           <wp:extent cx="7560310" cy="7923530"/>
           <wp:effectExtent l="0" t="0" r="2540" b="1270"/>
           <wp:wrapNone/>
-          <wp:docPr id="21" name="Picture 21" descr="ComneonCover" hidden="1"/>
+          <wp:docPr id="71" name="Picture 71" descr="ComneonCover" hidden="1"/>
           <wp:cNvGraphicFramePr>
             <a:graphicFrameLocks xmlns:a="http://schemas.openxmlformats.org/drawingml/2006/main" noChangeAspect="1"/>
           </wp:cNvGraphicFramePr>
@@ -9789,7 +10225,7 @@
           <wp:extent cx="1727835" cy="745490"/>
           <wp:effectExtent l="0" t="0" r="5715" b="0"/>
           <wp:wrapNone/>
-          <wp:docPr id="22" name="Picture 22" descr="ComneonLogo" hidden="1"/>
+          <wp:docPr id="72" name="Picture 72" descr="ComneonLogo" hidden="1"/>
           <wp:cNvGraphicFramePr>
             <a:graphicFrameLocks xmlns:a="http://schemas.openxmlformats.org/drawingml/2006/main" noChangeAspect="1"/>
           </wp:cNvGraphicFramePr>
@@ -9887,7 +10323,7 @@
               <wp:lineTo x="6310" y="0"/>
             </wp:wrapPolygon>
           </wp:wrapThrough>
-          <wp:docPr id="77" name="Picture 77"/>
+          <wp:docPr id="73" name="Picture 73"/>
           <wp:cNvGraphicFramePr>
             <a:graphicFrameLocks xmlns:a="http://schemas.openxmlformats.org/drawingml/2006/main" noChangeAspect="1"/>
           </wp:cNvGraphicFramePr>
@@ -10346,7 +10782,7 @@
                           </w:pPr>
                           <w:fldSimple w:instr=" DOCPROPERTY  Title_continued  \* MERGEFORMAT ">
                             <w:r>
-                              <w:t>automation tool to assist end-user in WCS PC host application</w:t>
+                              <w:t>The assistant in WCS PC host applications</w:t>
                             </w:r>
                           </w:fldSimple>
                         </w:p>
@@ -10404,7 +10840,7 @@
                     </w:pPr>
                     <w:fldSimple w:instr=" DOCPROPERTY  Title_continued  \* MERGEFORMAT ">
                       <w:r>
-                        <w:t>automation tool to assist end-user in WCS PC host application</w:t>
+                        <w:t>The assistant in WCS PC host applications</w:t>
                       </w:r>
                     </w:fldSimple>
                   </w:p>
@@ -10434,7 +10870,7 @@
           <wp:extent cx="1676400" cy="723265"/>
           <wp:effectExtent l="0" t="0" r="0" b="635"/>
           <wp:wrapNone/>
-          <wp:docPr id="78" name="Picture 78" descr="ComneonLogo" hidden="1"/>
+          <wp:docPr id="74" name="Picture 74" descr="ComneonLogo" hidden="1"/>
           <wp:cNvGraphicFramePr>
             <a:graphicFrameLocks xmlns:a="http://schemas.openxmlformats.org/drawingml/2006/main" noChangeAspect="1"/>
           </wp:cNvGraphicFramePr>
@@ -10616,7 +11052,7 @@
               <wp:lineTo x="6310" y="0"/>
             </wp:wrapPolygon>
           </wp:wrapThrough>
-          <wp:docPr id="55" name="Picture 55"/>
+          <wp:docPr id="75" name="Picture 75"/>
           <wp:cNvGraphicFramePr>
             <a:graphicFrameLocks xmlns:a="http://schemas.openxmlformats.org/drawingml/2006/main" noChangeAspect="1"/>
           </wp:cNvGraphicFramePr>
@@ -10931,7 +11367,7 @@
                           </w:pPr>
                           <w:fldSimple w:instr=" STYLEREF  &quot;Heading1,Heading1&quot;  \* MERGEFORMAT ">
                             <w:r>
-                              <w:t>Limitations of Infineon PD Logger</w:t>
+                              <w:t>Introduction</w:t>
                             </w:r>
                           </w:fldSimple>
                         </w:p>
@@ -10963,7 +11399,7 @@
                     </w:pPr>
                     <w:fldSimple w:instr=" STYLEREF  &quot;Heading1,Heading1&quot;  \* MERGEFORMAT ">
                       <w:r>
-                        <w:t>Limitations of Infineon PD Logger</w:t>
+                        <w:t>Introduction</w:t>
                       </w:r>
                     </w:fldSimple>
                   </w:p>
@@ -11096,7 +11532,7 @@
                                   <w:b w:val="0"/>
                                   <w:bCs/>
                                 </w:rPr>
-                                <w:t>automation tool to assist end-user in WCS PC host application</w:t>
+                                <w:t>The assistant in WCS PC host applications</w:t>
                               </w:r>
                             </w:p>
                           </w:sdtContent>
@@ -11180,7 +11616,7 @@
                             <w:b w:val="0"/>
                             <w:bCs/>
                           </w:rPr>
-                          <w:t>automation tool to assist end-user in WCS PC host application</w:t>
+                          <w:t>The assistant in WCS PC host applications</w:t>
                         </w:r>
                       </w:p>
                     </w:sdtContent>
@@ -11211,7 +11647,7 @@
           <wp:extent cx="1676400" cy="723265"/>
           <wp:effectExtent l="0" t="0" r="0" b="635"/>
           <wp:wrapNone/>
-          <wp:docPr id="56" name="Picture 56" descr="ComneonLogo" hidden="1"/>
+          <wp:docPr id="76" name="Picture 76" descr="ComneonLogo" hidden="1"/>
           <wp:cNvGraphicFramePr>
             <a:graphicFrameLocks xmlns:a="http://schemas.openxmlformats.org/drawingml/2006/main" noChangeAspect="1"/>
           </wp:cNvGraphicFramePr>
@@ -11850,7 +12286,7 @@
                                   <w:b w:val="0"/>
                                   <w:bCs/>
                                 </w:rPr>
-                                <w:t>automation tool to assist end-user in WCS PC host application</w:t>
+                                <w:t>The assistant in WCS PC host applications</w:t>
                               </w:r>
                             </w:p>
                           </w:sdtContent>
@@ -11934,7 +12370,7 @@
                             <w:b w:val="0"/>
                             <w:bCs/>
                           </w:rPr>
-                          <w:t>automation tool to assist end-user in WCS PC host application</w:t>
+                          <w:t>The assistant in WCS PC host applications</w:t>
                         </w:r>
                       </w:p>
                     </w:sdtContent>
@@ -12577,7 +13013,7 @@
                           </w:pPr>
                           <w:fldSimple w:instr=" DOCPROPERTY  Title_continued  \* MERGEFORMAT ">
                             <w:r>
-                              <w:t>automation tool to assist end-user in WCS PC host application</w:t>
+                              <w:t>The assistant in WCS PC host applications</w:t>
                             </w:r>
                           </w:fldSimple>
                         </w:p>
@@ -12635,7 +13071,7 @@
                     </w:pPr>
                     <w:fldSimple w:instr=" DOCPROPERTY  Title_continued  \* MERGEFORMAT ">
                       <w:r>
-                        <w:t>automation tool to assist end-user in WCS PC host application</w:t>
+                        <w:t>The assistant in WCS PC host applications</w:t>
                       </w:r>
                     </w:fldSimple>
                   </w:p>
@@ -16915,7 +17351,7 @@
   </w:latentStyles>
   <w:style w:type="paragraph" w:default="1" w:styleId="Normal">
     <w:name w:val="Normal"/>
-    <w:rsid w:val="0011119B"/>
+    <w:rsid w:val="007D4D98"/>
     <w:rPr>
       <w:lang w:val="en-GB"/>
     </w:rPr>
@@ -19231,9 +19667,13 @@
   <w:rsids>
     <w:rsidRoot w:val="00E77BEB"/>
     <w:rsid w:val="000E731D"/>
+    <w:rsid w:val="001A1816"/>
     <w:rsid w:val="001B38D5"/>
+    <w:rsid w:val="0035089C"/>
+    <w:rsid w:val="003A13C3"/>
     <w:rsid w:val="003E2ECB"/>
     <w:rsid w:val="003F128C"/>
+    <w:rsid w:val="004151A8"/>
     <w:rsid w:val="004A2FD3"/>
     <w:rsid w:val="005B06AD"/>
     <w:rsid w:val="005D5B36"/>
@@ -19242,6 +19682,8 @@
     <w:rsid w:val="009D5547"/>
     <w:rsid w:val="00A74F06"/>
     <w:rsid w:val="00B12E07"/>
+    <w:rsid w:val="00B66AC6"/>
+    <w:rsid w:val="00C753A9"/>
     <w:rsid w:val="00E0017A"/>
     <w:rsid w:val="00E77BEB"/>
     <w:rsid w:val="00F12BC2"/>

</xml_diff>